<commit_message>
Feat: Improve report formatting and heading levels
Co-authored-by: imtiazahmed <imtiazahmed@esquall.com>
</commit_message>
<xml_diff>
--- a/ClassLink_Partner_Portal_API_Feasibility_Report.docx
+++ b/ClassLink_Partner_Portal_API_Feasibility_Report.docx
@@ -183,6 +183,9 @@
           </w:tcPr>
           <w:p>
             <w:r>
+              <w:rPr>
+                <w:b/>
+              </w:rPr>
               <w:t>Endpoint</w:t>
             </w:r>
           </w:p>
@@ -193,6 +196,9 @@
           </w:tcPr>
           <w:p>
             <w:r>
+              <w:rPr>
+                <w:b/>
+              </w:rPr>
               <w:t>Method</w:t>
             </w:r>
           </w:p>
@@ -203,6 +209,9 @@
           </w:tcPr>
           <w:p>
             <w:r>
+              <w:rPr>
+                <w:b/>
+              </w:rPr>
               <w:t>Purpose</w:t>
             </w:r>
           </w:p>
@@ -213,6 +222,9 @@
           </w:tcPr>
           <w:p>
             <w:r>
+              <w:rPr>
+                <w:b/>
+              </w:rPr>
               <w:t>Parameters</w:t>
             </w:r>
           </w:p>
@@ -4815,6 +4827,9 @@
           </w:tcPr>
           <w:p>
             <w:r>
+              <w:rPr>
+                <w:b/>
+              </w:rPr>
               <w:t>Risk</w:t>
             </w:r>
           </w:p>
@@ -4825,6 +4840,9 @@
           </w:tcPr>
           <w:p>
             <w:r>
+              <w:rPr>
+                <w:b/>
+              </w:rPr>
               <w:t>Probability</w:t>
             </w:r>
           </w:p>
@@ -4835,6 +4853,9 @@
           </w:tcPr>
           <w:p>
             <w:r>
+              <w:rPr>
+                <w:b/>
+              </w:rPr>
               <w:t>Impact</w:t>
             </w:r>
           </w:p>
@@ -4845,6 +4866,9 @@
           </w:tcPr>
           <w:p>
             <w:r>
+              <w:rPr>
+                <w:b/>
+              </w:rPr>
               <w:t>Mitigation</w:t>
             </w:r>
           </w:p>
@@ -5129,6 +5153,9 @@
           </w:tcPr>
           <w:p>
             <w:r>
+              <w:rPr>
+                <w:b/>
+              </w:rPr>
               <w:t>Risk</w:t>
             </w:r>
           </w:p>
@@ -5139,6 +5166,9 @@
           </w:tcPr>
           <w:p>
             <w:r>
+              <w:rPr>
+                <w:b/>
+              </w:rPr>
               <w:t>Probability</w:t>
             </w:r>
           </w:p>
@@ -5149,6 +5179,9 @@
           </w:tcPr>
           <w:p>
             <w:r>
+              <w:rPr>
+                <w:b/>
+              </w:rPr>
               <w:t>Impact</w:t>
             </w:r>
           </w:p>
@@ -5159,6 +5192,9 @@
           </w:tcPr>
           <w:p>
             <w:r>
+              <w:rPr>
+                <w:b/>
+              </w:rPr>
               <w:t>Mitigation</w:t>
             </w:r>
           </w:p>
@@ -6105,6 +6141,9 @@
           </w:tcPr>
           <w:p>
             <w:r>
+              <w:rPr>
+                <w:b/>
+              </w:rPr>
               <w:t>Endpoint</w:t>
             </w:r>
           </w:p>
@@ -6115,6 +6154,9 @@
           </w:tcPr>
           <w:p>
             <w:r>
+              <w:rPr>
+                <w:b/>
+              </w:rPr>
               <w:t>Method</w:t>
             </w:r>
           </w:p>
@@ -6125,6 +6167,9 @@
           </w:tcPr>
           <w:p>
             <w:r>
+              <w:rPr>
+                <w:b/>
+              </w:rPr>
               <w:t>Auth</w:t>
             </w:r>
           </w:p>
@@ -6135,6 +6180,9 @@
           </w:tcPr>
           <w:p>
             <w:r>
+              <w:rPr>
+                <w:b/>
+              </w:rPr>
               <w:t>Purpose</w:t>
             </w:r>
           </w:p>

</xml_diff>

<commit_message>
feat: Add cover page and table of contents to report
Co-authored-by: imtiazahmed <imtiazahmed@esquall.com>
</commit_message>
<xml_diff>
--- a/ClassLink_Partner_Portal_API_Feasibility_Report.docx
+++ b/ClassLink_Partner_Portal_API_Feasibility_Report.docx
@@ -3,75 +3,150 @@
 <w:document xmlns:wpc="http://schemas.microsoft.com/office/word/2010/wordprocessingCanvas" xmlns:mo="http://schemas.microsoft.com/office/mac/office/2008/main" xmlns:mc="http://schemas.openxmlformats.org/markup-compatibility/2006" xmlns:mv="urn:schemas-microsoft-com:mac:vml" xmlns:o="urn:schemas-microsoft-com:office:office" xmlns:r="http://schemas.openxmlformats.org/officeDocument/2006/relationships" xmlns:m="http://schemas.openxmlformats.org/officeDocument/2006/math" xmlns:v="urn:schemas-microsoft-com:vml" xmlns:wp14="http://schemas.microsoft.com/office/word/2010/wordprocessingDrawing" xmlns:wp="http://schemas.openxmlformats.org/drawingml/2006/wordprocessingDrawing" xmlns:w10="urn:schemas-microsoft-com:office:word" xmlns:w="http://schemas.openxmlformats.org/wordprocessingml/2006/main" xmlns:w14="http://schemas.microsoft.com/office/word/2010/wordml" xmlns:wpg="http://schemas.microsoft.com/office/word/2010/wordprocessingGroup" xmlns:wpi="http://schemas.microsoft.com/office/word/2010/wordprocessingInk" xmlns:wne="http://schemas.microsoft.com/office/word/2006/wordml" xmlns:wps="http://schemas.microsoft.com/office/word/2010/wordprocessingShape" mc:Ignorable="w14 wp14">
   <w:body>
     <w:p>
-      <w:r>
-        <w:t># ClassLink Partner Portal API Feasibility Detail Report</w:t>
-      </w:r>
-    </w:p>
-    <w:p>
-      <w:r>
-        <w:t>## MyGPS Integration - Technical API Analysis</w:t>
+      <w:pPr>
+        <w:pStyle w:val="Title"/>
+        <w:jc w:val="center"/>
+      </w:pPr>
+      <w:r>
+        <w:rPr>
+          <w:sz w:val="56"/>
+        </w:rPr>
+        <w:t>ClassLink Partner Portal API Feasibility Detail Report</w:t>
+      </w:r>
+    </w:p>
+    <w:p>
+      <w:pPr>
+        <w:pStyle w:val="Subtitle"/>
+        <w:jc w:val="center"/>
+      </w:pPr>
+      <w:r>
+        <w:t>MyGPS Integration - Technical API Analysis</w:t>
       </w:r>
     </w:p>
     <w:p/>
     <w:p>
+      <w:pPr>
+        <w:spacing w:after="80"/>
+        <w:jc w:val="center"/>
+      </w:pPr>
       <w:r>
         <w:rPr>
           <w:b/>
         </w:rPr>
-        <w:t>Document Version:</w:t>
-      </w:r>
-      <w:r>
-        <w:t xml:space="preserve"> 1.0</w:t>
-      </w:r>
-    </w:p>
-    <w:p>
+        <w:t xml:space="preserve">Document Version:: </w:t>
+      </w:r>
+      <w:r>
+        <w:t>1.0</w:t>
+      </w:r>
+    </w:p>
+    <w:p>
+      <w:pPr>
+        <w:spacing w:after="80"/>
+        <w:jc w:val="center"/>
+      </w:pPr>
       <w:r>
         <w:rPr>
           <w:b/>
         </w:rPr>
-        <w:t>Date:</w:t>
-      </w:r>
-      <w:r>
-        <w:t xml:space="preserve"> December 2024</w:t>
-      </w:r>
-    </w:p>
-    <w:p>
+        <w:t xml:space="preserve">Date:: </w:t>
+      </w:r>
+      <w:r>
+        <w:t>December 2024</w:t>
+      </w:r>
+    </w:p>
+    <w:p>
+      <w:pPr>
+        <w:spacing w:after="80"/>
+        <w:jc w:val="center"/>
+      </w:pPr>
       <w:r>
         <w:rPr>
           <w:b/>
         </w:rPr>
-        <w:t>Prepared for:</w:t>
-      </w:r>
-      <w:r>
-        <w:t xml:space="preserve"> MyGPS Platform Integration</w:t>
-      </w:r>
-    </w:p>
-    <w:p>
+        <w:t xml:space="preserve">Prepared for:: </w:t>
+      </w:r>
+      <w:r>
+        <w:t>MyGPS Platform Integration</w:t>
+      </w:r>
+    </w:p>
+    <w:p>
+      <w:pPr>
+        <w:spacing w:after="80"/>
+        <w:jc w:val="center"/>
+      </w:pPr>
       <w:r>
         <w:rPr>
           <w:b/>
         </w:rPr>
-        <w:t>Prepared by:</w:t>
-      </w:r>
-      <w:r>
-        <w:t xml:space="preserve"> Technical Integration Team</w:t>
+        <w:t xml:space="preserve">Prepared by:: </w:t>
+      </w:r>
+      <w:r>
+        <w:t>Technical Integration Team</w:t>
       </w:r>
     </w:p>
     <w:p/>
     <w:p/>
     <w:p>
       <w:r>
+        <w:br w:type="page"/>
+      </w:r>
+    </w:p>
+    <w:p>
+      <w:pPr>
+        <w:pStyle w:val="TOCHeading"/>
+      </w:pPr>
+      <w:r>
+        <w:t>Table of Contents</w:t>
+      </w:r>
+    </w:p>
+    <w:p>
+      <w:r>
+        <w:fldChar w:fldCharType="begin"/>
+        <w:instrText xml:space="preserve">TOC \o "1-3" \h \z \u</w:instrText>
+        <w:fldChar w:fldCharType="separate"/>
+        <w:t/>
+        <w:fldChar w:fldCharType="end"/>
+      </w:r>
+    </w:p>
+    <w:p>
+      <w:pPr>
+        <w:spacing w:before="120" w:line="288" w:lineRule="auto"/>
+      </w:pPr>
+      <w:r>
+        <w:rPr>
+          <w:i/>
+        </w:rPr>
+        <w:t>Note: In Word, right-click this Table of Contents and choose 'Update Field' to refresh page numbers.</w:t>
+      </w:r>
+    </w:p>
+    <w:p>
+      <w:r>
+        <w:br w:type="page"/>
+      </w:r>
+    </w:p>
+    <w:p/>
+    <w:p>
+      <w:pPr>
+        <w:spacing w:line="312" w:lineRule="auto" w:after="120"/>
+      </w:pPr>
+      <w:r>
         <w:t>## Executive Summary</w:t>
       </w:r>
     </w:p>
     <w:p/>
     <w:p>
+      <w:pPr>
+        <w:spacing w:line="312" w:lineRule="auto" w:after="120"/>
+      </w:pPr>
       <w:r>
         <w:t>This document provides a detailed technical analysis of the ClassLink Partner Portal API integration for MyGPS. The report evaluates API endpoints, authentication mechanisms, data access patterns, security requirements, and operational considerations to determine the feasibility of integrating ClassLink's user data access capabilities with the MyGPS platform.</w:t>
       </w:r>
     </w:p>
     <w:p/>
     <w:p>
+      <w:pPr>
+        <w:spacing w:line="312" w:lineRule="auto" w:after="120"/>
+      </w:pPr>
       <w:r>
         <w:rPr>
           <w:b/>
@@ -82,6 +157,7 @@
     <w:p>
       <w:pPr>
         <w:pStyle w:val="ListBullet"/>
+        <w:spacing w:line="312" w:lineRule="auto" w:after="0" w:before="0"/>
       </w:pPr>
       <w:r>
         <w:t>✅ OAuth2/OpenID Connect authentication is fully supported</w:t>
@@ -90,6 +166,7 @@
     <w:p>
       <w:pPr>
         <w:pStyle w:val="ListBullet"/>
+        <w:spacing w:line="312" w:lineRule="auto" w:after="0" w:before="0"/>
       </w:pPr>
       <w:r>
         <w:t>✅ Partner Portal APIs provide comprehensive user data access</w:t>
@@ -98,6 +175,7 @@
     <w:p>
       <w:pPr>
         <w:pStyle w:val="ListBullet"/>
+        <w:spacing w:line="312" w:lineRule="auto" w:after="0" w:before="0"/>
       </w:pPr>
       <w:r>
         <w:t>✅ Scheduled synchronization is technically feasible</w:t>
@@ -106,6 +184,7 @@
     <w:p>
       <w:pPr>
         <w:pStyle w:val="ListBullet"/>
+        <w:spacing w:line="312" w:lineRule="auto" w:after="0" w:before="0"/>
       </w:pPr>
       <w:r>
         <w:t>⚠️ Custom login pages are not permitted by ClassLink</w:t>
@@ -114,6 +193,7 @@
     <w:p>
       <w:pPr>
         <w:pStyle w:val="ListBullet"/>
+        <w:spacing w:line="312" w:lineRule="auto" w:after="0" w:before="0"/>
       </w:pPr>
       <w:r>
         <w:t>⚠️ Token management requires robust refresh mechanisms</w:t>
@@ -122,6 +202,7 @@
     <w:p>
       <w:pPr>
         <w:pStyle w:val="ListBullet"/>
+        <w:spacing w:line="312" w:lineRule="auto" w:after="0" w:before="0"/>
       </w:pPr>
       <w:r>
         <w:t>✅ SSL/TLS encryption is mandatory and supported</w:t>
@@ -130,23 +211,35 @@
     <w:p/>
     <w:p/>
     <w:p>
+      <w:pPr>
+        <w:spacing w:line="312" w:lineRule="auto" w:after="120"/>
+      </w:pPr>
       <w:r>
         <w:t>## 1. API Architecture &amp; Endpoints</w:t>
       </w:r>
     </w:p>
     <w:p/>
     <w:p>
+      <w:pPr>
+        <w:spacing w:line="312" w:lineRule="auto" w:after="120"/>
+      </w:pPr>
       <w:r>
         <w:t>### 1.1 Authentication Endpoints</w:t>
       </w:r>
     </w:p>
     <w:p/>
     <w:p>
+      <w:pPr>
+        <w:spacing w:line="312" w:lineRule="auto" w:after="120"/>
+      </w:pPr>
       <w:r>
         <w:t>#### OAuth2 Authorization Flow</w:t>
       </w:r>
     </w:p>
     <w:p>
+      <w:pPr>
+        <w:spacing w:line="312" w:lineRule="auto" w:after="120"/>
+      </w:pPr>
       <w:r>
         <w:rPr>
           <w:b/>
@@ -359,6 +452,9 @@
     </w:tbl>
     <w:p/>
     <w:p>
+      <w:pPr>
+        <w:spacing w:line="312" w:lineRule="auto" w:after="120"/>
+      </w:pPr>
       <w:r>
         <w:rPr>
           <w:b/>
@@ -369,6 +465,7 @@
     <w:p>
       <w:pPr>
         <w:pStyle w:val="ListBullet"/>
+        <w:spacing w:line="312" w:lineRule="auto" w:after="0" w:before="0"/>
       </w:pPr>
       <w:r>
         <w:rPr>
@@ -389,6 +486,7 @@
     <w:p>
       <w:pPr>
         <w:pStyle w:val="ListBullet"/>
+        <w:spacing w:line="312" w:lineRule="auto" w:after="0" w:before="0"/>
       </w:pPr>
       <w:r>
         <w:rPr>
@@ -403,6 +501,7 @@
     <w:p>
       <w:pPr>
         <w:pStyle w:val="ListBullet"/>
+        <w:spacing w:line="312" w:lineRule="auto" w:after="0" w:before="0"/>
       </w:pPr>
       <w:r>
         <w:rPr>
@@ -417,6 +516,7 @@
     <w:p>
       <w:pPr>
         <w:pStyle w:val="ListBullet"/>
+        <w:spacing w:line="312" w:lineRule="auto" w:after="0" w:before="0"/>
       </w:pPr>
       <w:r>
         <w:rPr>
@@ -430,23 +530,35 @@
     </w:p>
     <w:p/>
     <w:p>
+      <w:pPr>
+        <w:spacing w:line="312" w:lineRule="auto" w:after="120"/>
+      </w:pPr>
       <w:r>
         <w:t>### 1.2 Data Access Endpoints</w:t>
       </w:r>
     </w:p>
     <w:p/>
     <w:p>
+      <w:pPr>
+        <w:spacing w:line="312" w:lineRule="auto" w:after="120"/>
+      </w:pPr>
       <w:r>
         <w:t>#### User Data Access</w:t>
       </w:r>
     </w:p>
     <w:p>
+      <w:pPr>
+        <w:spacing w:line="312" w:lineRule="auto" w:after="120"/>
+      </w:pPr>
       <w:r>
         <w:t>Based on ClassLink Partner Portal API documentation, the following endpoints are available for accessing user data:</w:t>
       </w:r>
     </w:p>
     <w:p/>
     <w:p>
+      <w:pPr>
+        <w:spacing w:line="312" w:lineRule="auto" w:after="120"/>
+      </w:pPr>
       <w:r>
         <w:rPr>
           <w:b/>
@@ -457,6 +569,7 @@
     <w:p>
       <w:pPr>
         <w:pStyle w:val="ListBullet"/>
+        <w:spacing w:line="312" w:lineRule="auto" w:after="0" w:before="0"/>
       </w:pPr>
       <w:r>
         <w:rPr>
@@ -477,6 +590,7 @@
     <w:p>
       <w:pPr>
         <w:pStyle w:val="ListBullet"/>
+        <w:spacing w:line="312" w:lineRule="auto" w:after="0" w:before="0"/>
       </w:pPr>
       <w:r>
         <w:rPr>
@@ -491,6 +605,7 @@
     <w:p>
       <w:pPr>
         <w:pStyle w:val="ListBullet"/>
+        <w:spacing w:line="312" w:lineRule="auto" w:after="0" w:before="0"/>
       </w:pPr>
       <w:r>
         <w:rPr>
@@ -505,6 +620,7 @@
     <w:p>
       <w:pPr>
         <w:pStyle w:val="ListBullet"/>
+        <w:spacing w:line="312" w:lineRule="auto" w:after="0" w:before="0"/>
       </w:pPr>
       <w:r>
         <w:rPr>
@@ -519,6 +635,7 @@
     <w:p>
       <w:pPr>
         <w:pStyle w:val="ListBullet"/>
+        <w:spacing w:line="312" w:lineRule="auto" w:after="0" w:before="0"/>
       </w:pPr>
       <w:r>
         <w:rPr>
@@ -530,6 +647,7 @@
     <w:p>
       <w:pPr>
         <w:pStyle w:val="ListBullet"/>
+        <w:spacing w:line="312" w:lineRule="auto" w:after="0" w:before="0"/>
         <w:ind w:left="240"/>
       </w:pPr>
       <w:r>
@@ -545,6 +663,7 @@
     <w:p>
       <w:pPr>
         <w:pStyle w:val="ListBullet"/>
+        <w:spacing w:line="312" w:lineRule="auto" w:after="0" w:before="0"/>
         <w:ind w:left="240"/>
       </w:pPr>
       <w:r>
@@ -560,6 +679,7 @@
     <w:p>
       <w:pPr>
         <w:pStyle w:val="ListBullet"/>
+        <w:spacing w:line="312" w:lineRule="auto" w:after="0" w:before="0"/>
         <w:ind w:left="240"/>
       </w:pPr>
       <w:r>
@@ -574,6 +694,9 @@
     </w:p>
     <w:p/>
     <w:p>
+      <w:pPr>
+        <w:spacing w:line="312" w:lineRule="auto" w:after="120"/>
+      </w:pPr>
       <w:r>
         <w:rPr>
           <w:b/>
@@ -584,6 +707,7 @@
     <w:p>
       <w:pPr>
         <w:pStyle w:val="ListBullet"/>
+        <w:spacing w:line="312" w:lineRule="auto" w:after="0" w:before="0"/>
       </w:pPr>
       <w:r>
         <w:rPr>
@@ -604,6 +728,7 @@
     <w:p>
       <w:pPr>
         <w:pStyle w:val="ListBullet"/>
+        <w:spacing w:line="312" w:lineRule="auto" w:after="0" w:before="0"/>
       </w:pPr>
       <w:r>
         <w:rPr>
@@ -618,6 +743,7 @@
     <w:p>
       <w:pPr>
         <w:pStyle w:val="ListBullet"/>
+        <w:spacing w:line="312" w:lineRule="auto" w:after="0" w:before="0"/>
       </w:pPr>
       <w:r>
         <w:rPr>
@@ -632,6 +758,7 @@
     <w:p>
       <w:pPr>
         <w:pStyle w:val="ListBullet"/>
+        <w:spacing w:line="312" w:lineRule="auto" w:after="0" w:before="0"/>
       </w:pPr>
       <w:r>
         <w:rPr>
@@ -645,6 +772,9 @@
     </w:p>
     <w:p/>
     <w:p>
+      <w:pPr>
+        <w:spacing w:line="312" w:lineRule="auto" w:after="120"/>
+      </w:pPr>
       <w:r>
         <w:rPr>
           <w:b/>
@@ -655,6 +785,7 @@
     <w:p>
       <w:pPr>
         <w:pStyle w:val="ListBullet"/>
+        <w:spacing w:line="312" w:lineRule="auto" w:after="0" w:before="0"/>
       </w:pPr>
       <w:r>
         <w:rPr>
@@ -675,6 +806,7 @@
     <w:p>
       <w:pPr>
         <w:pStyle w:val="ListBullet"/>
+        <w:spacing w:line="312" w:lineRule="auto" w:after="0" w:before="0"/>
       </w:pPr>
       <w:r>
         <w:rPr>
@@ -689,6 +821,7 @@
     <w:p>
       <w:pPr>
         <w:pStyle w:val="ListBullet"/>
+        <w:spacing w:line="312" w:lineRule="auto" w:after="0" w:before="0"/>
       </w:pPr>
       <w:r>
         <w:rPr>
@@ -703,6 +836,7 @@
     <w:p>
       <w:pPr>
         <w:pStyle w:val="ListBullet"/>
+        <w:spacing w:line="312" w:lineRule="auto" w:after="0" w:before="0"/>
       </w:pPr>
       <w:r>
         <w:rPr>
@@ -716,6 +850,9 @@
     </w:p>
     <w:p/>
     <w:p>
+      <w:pPr>
+        <w:spacing w:line="312" w:lineRule="auto" w:after="120"/>
+      </w:pPr>
       <w:r>
         <w:rPr>
           <w:b/>
@@ -726,6 +863,7 @@
     <w:p>
       <w:pPr>
         <w:pStyle w:val="ListBullet"/>
+        <w:spacing w:line="312" w:lineRule="auto" w:after="0" w:before="0"/>
       </w:pPr>
       <w:r>
         <w:rPr>
@@ -746,6 +884,7 @@
     <w:p>
       <w:pPr>
         <w:pStyle w:val="ListBullet"/>
+        <w:spacing w:line="312" w:lineRule="auto" w:after="0" w:before="0"/>
       </w:pPr>
       <w:r>
         <w:rPr>
@@ -760,6 +899,7 @@
     <w:p>
       <w:pPr>
         <w:pStyle w:val="ListBullet"/>
+        <w:spacing w:line="312" w:lineRule="auto" w:after="0" w:before="0"/>
       </w:pPr>
       <w:r>
         <w:rPr>
@@ -774,6 +914,7 @@
     <w:p>
       <w:pPr>
         <w:pStyle w:val="ListBullet"/>
+        <w:spacing w:line="312" w:lineRule="auto" w:after="0" w:before="0"/>
       </w:pPr>
       <w:r>
         <w:rPr>
@@ -787,12 +928,18 @@
     </w:p>
     <w:p/>
     <w:p>
+      <w:pPr>
+        <w:spacing w:line="312" w:lineRule="auto" w:after="120"/>
+      </w:pPr>
       <w:r>
         <w:t>### 1.3 SSO Integration Endpoints</w:t>
       </w:r>
     </w:p>
     <w:p/>
     <w:p>
+      <w:pPr>
+        <w:spacing w:line="312" w:lineRule="auto" w:after="120"/>
+      </w:pPr>
       <w:r>
         <w:rPr>
           <w:b/>
@@ -803,6 +950,7 @@
     <w:p>
       <w:pPr>
         <w:pStyle w:val="ListBullet"/>
+        <w:spacing w:line="312" w:lineRule="auto" w:after="0" w:before="0"/>
       </w:pPr>
       <w:r>
         <w:rPr>
@@ -823,6 +971,7 @@
     <w:p>
       <w:pPr>
         <w:pStyle w:val="ListBullet"/>
+        <w:spacing w:line="312" w:lineRule="auto" w:after="0" w:before="0"/>
       </w:pPr>
       <w:r>
         <w:rPr>
@@ -837,6 +986,7 @@
     <w:p>
       <w:pPr>
         <w:pStyle w:val="ListBullet"/>
+        <w:spacing w:line="312" w:lineRule="auto" w:after="0" w:before="0"/>
       </w:pPr>
       <w:r>
         <w:rPr>
@@ -850,6 +1000,9 @@
     </w:p>
     <w:p/>
     <w:p>
+      <w:pPr>
+        <w:spacing w:line="312" w:lineRule="auto" w:after="120"/>
+      </w:pPr>
       <w:r>
         <w:rPr>
           <w:b/>
@@ -860,6 +1013,7 @@
     <w:p>
       <w:pPr>
         <w:pStyle w:val="ListBullet"/>
+        <w:spacing w:line="312" w:lineRule="auto" w:after="0" w:before="0"/>
       </w:pPr>
       <w:r>
         <w:rPr>
@@ -874,6 +1028,7 @@
     <w:p>
       <w:pPr>
         <w:pStyle w:val="ListBullet"/>
+        <w:spacing w:line="312" w:lineRule="auto" w:after="0" w:before="0"/>
       </w:pPr>
       <w:r>
         <w:rPr>
@@ -888,6 +1043,7 @@
     <w:p>
       <w:pPr>
         <w:pStyle w:val="ListBullet"/>
+        <w:spacing w:line="312" w:lineRule="auto" w:after="0" w:before="0"/>
       </w:pPr>
       <w:r>
         <w:rPr>
@@ -902,18 +1058,27 @@
     <w:p/>
     <w:p/>
     <w:p>
+      <w:pPr>
+        <w:spacing w:line="312" w:lineRule="auto" w:after="120"/>
+      </w:pPr>
       <w:r>
         <w:t>## 2. Authentication &amp; Authorization</w:t>
       </w:r>
     </w:p>
     <w:p/>
     <w:p>
+      <w:pPr>
+        <w:spacing w:line="312" w:lineRule="auto" w:after="120"/>
+      </w:pPr>
       <w:r>
         <w:t>### 2.1 OAuth2 Flow Implementation</w:t>
       </w:r>
     </w:p>
     <w:p/>
     <w:p>
+      <w:pPr>
+        <w:spacing w:line="312" w:lineRule="auto" w:after="120"/>
+      </w:pPr>
       <w:r>
         <w:rPr>
           <w:b/>
@@ -925,6 +1090,7 @@
     <w:p>
       <w:pPr>
         <w:pStyle w:val="ListNumber"/>
+        <w:spacing w:line="312" w:lineRule="auto" w:after="0" w:before="0"/>
       </w:pPr>
       <w:r>
         <w:rPr>
@@ -934,6 +1100,11 @@
       </w:r>
     </w:p>
     <w:p>
+      <w:pPr>
+        <w:pStyle w:val="IntenseQuote"/>
+        <w:spacing w:before="120" w:after="120"/>
+        <w:ind w:left="360"/>
+      </w:pPr>
       <w:r>
         <w:rPr>
           <w:rFonts w:ascii="Courier New" w:hAnsi="Courier New"/>
@@ -986,6 +1157,7 @@
     <w:p>
       <w:pPr>
         <w:pStyle w:val="ListNumber"/>
+        <w:spacing w:line="312" w:lineRule="auto" w:after="0" w:before="0"/>
       </w:pPr>
       <w:r>
         <w:rPr>
@@ -997,6 +1169,7 @@
     <w:p>
       <w:pPr>
         <w:pStyle w:val="ListBullet"/>
+        <w:spacing w:line="312" w:lineRule="auto" w:after="0" w:before="0"/>
         <w:ind w:left="240"/>
       </w:pPr>
       <w:r>
@@ -1006,6 +1179,7 @@
     <w:p>
       <w:pPr>
         <w:pStyle w:val="ListBullet"/>
+        <w:spacing w:line="312" w:lineRule="auto" w:after="0" w:before="0"/>
         <w:ind w:left="240"/>
       </w:pPr>
       <w:r>
@@ -1015,6 +1189,7 @@
     <w:p>
       <w:pPr>
         <w:pStyle w:val="ListBullet"/>
+        <w:spacing w:line="312" w:lineRule="auto" w:after="0" w:before="0"/>
         <w:ind w:left="240"/>
       </w:pPr>
       <w:r>
@@ -1025,6 +1200,7 @@
     <w:p>
       <w:pPr>
         <w:pStyle w:val="ListNumber"/>
+        <w:spacing w:line="312" w:lineRule="auto" w:after="0" w:before="0"/>
       </w:pPr>
       <w:r>
         <w:rPr>
@@ -1034,6 +1210,11 @@
       </w:r>
     </w:p>
     <w:p>
+      <w:pPr>
+        <w:pStyle w:val="IntenseQuote"/>
+        <w:spacing w:before="120" w:after="120"/>
+        <w:ind w:left="360"/>
+      </w:pPr>
       <w:r>
         <w:rPr>
           <w:rFonts w:ascii="Courier New" w:hAnsi="Courier New"/>
@@ -1102,6 +1283,7 @@
     <w:p>
       <w:pPr>
         <w:pStyle w:val="ListNumber"/>
+        <w:spacing w:line="312" w:lineRule="auto" w:after="0" w:before="0"/>
       </w:pPr>
       <w:r>
         <w:rPr>
@@ -1111,6 +1293,11 @@
       </w:r>
     </w:p>
     <w:p>
+      <w:pPr>
+        <w:pStyle w:val="IntenseQuote"/>
+        <w:spacing w:before="120" w:after="120"/>
+        <w:ind w:left="360"/>
+      </w:pPr>
       <w:r>
         <w:rPr>
           <w:rFonts w:ascii="Courier New" w:hAnsi="Courier New"/>
@@ -1169,12 +1356,18 @@
     </w:p>
     <w:p/>
     <w:p>
+      <w:pPr>
+        <w:spacing w:line="312" w:lineRule="auto" w:after="120"/>
+      </w:pPr>
       <w:r>
         <w:t>### 2.2 Required Scopes</w:t>
       </w:r>
     </w:p>
     <w:p/>
     <w:p>
+      <w:pPr>
+        <w:spacing w:line="312" w:lineRule="auto" w:after="120"/>
+      </w:pPr>
       <w:r>
         <w:rPr>
           <w:b/>
@@ -1185,6 +1378,7 @@
     <w:p>
       <w:pPr>
         <w:pStyle w:val="ListBullet"/>
+        <w:spacing w:line="312" w:lineRule="auto" w:after="0" w:before="0"/>
       </w:pPr>
       <w:r>
         <w:rPr>
@@ -1199,6 +1393,7 @@
     <w:p>
       <w:pPr>
         <w:pStyle w:val="ListBullet"/>
+        <w:spacing w:line="312" w:lineRule="auto" w:after="0" w:before="0"/>
       </w:pPr>
       <w:r>
         <w:rPr>
@@ -1213,6 +1408,7 @@
     <w:p>
       <w:pPr>
         <w:pStyle w:val="ListBullet"/>
+        <w:spacing w:line="312" w:lineRule="auto" w:after="0" w:before="0"/>
       </w:pPr>
       <w:r>
         <w:rPr>
@@ -1227,6 +1423,7 @@
     <w:p>
       <w:pPr>
         <w:pStyle w:val="ListBullet"/>
+        <w:spacing w:line="312" w:lineRule="auto" w:after="0" w:before="0"/>
       </w:pPr>
       <w:r>
         <w:rPr>
@@ -1241,6 +1438,7 @@
     <w:p>
       <w:pPr>
         <w:pStyle w:val="ListBullet"/>
+        <w:spacing w:line="312" w:lineRule="auto" w:after="0" w:before="0"/>
       </w:pPr>
       <w:r>
         <w:rPr>
@@ -1255,6 +1453,7 @@
     <w:p>
       <w:pPr>
         <w:pStyle w:val="ListBullet"/>
+        <w:spacing w:line="312" w:lineRule="auto" w:after="0" w:before="0"/>
       </w:pPr>
       <w:r>
         <w:rPr>
@@ -1268,6 +1467,9 @@
     </w:p>
     <w:p/>
     <w:p>
+      <w:pPr>
+        <w:spacing w:line="312" w:lineRule="auto" w:after="120"/>
+      </w:pPr>
       <w:r>
         <w:rPr>
           <w:b/>
@@ -1276,6 +1478,11 @@
       </w:r>
     </w:p>
     <w:p>
+      <w:pPr>
+        <w:pStyle w:val="IntenseQuote"/>
+        <w:spacing w:before="120" w:after="120"/>
+        <w:ind w:left="360"/>
+      </w:pPr>
       <w:r>
         <w:rPr>
           <w:rFonts w:ascii="Courier New" w:hAnsi="Courier New"/>
@@ -1286,12 +1493,18 @@
     </w:p>
     <w:p/>
     <w:p>
+      <w:pPr>
+        <w:spacing w:line="312" w:lineRule="auto" w:after="120"/>
+      </w:pPr>
       <w:r>
         <w:t>### 2.3 Token Management Strategy</w:t>
       </w:r>
     </w:p>
     <w:p/>
     <w:p>
+      <w:pPr>
+        <w:spacing w:line="312" w:lineRule="auto" w:after="120"/>
+      </w:pPr>
       <w:r>
         <w:rPr>
           <w:b/>
@@ -1302,6 +1515,7 @@
     <w:p>
       <w:pPr>
         <w:pStyle w:val="ListBullet"/>
+        <w:spacing w:line="312" w:lineRule="auto" w:after="0" w:before="0"/>
       </w:pPr>
       <w:r>
         <w:t>Access tokens: Encrypted at rest in database</w:t>
@@ -1310,6 +1524,7 @@
     <w:p>
       <w:pPr>
         <w:pStyle w:val="ListBullet"/>
+        <w:spacing w:line="312" w:lineRule="auto" w:after="0" w:before="0"/>
       </w:pPr>
       <w:r>
         <w:t>Refresh tokens: Securely stored with encryption</w:t>
@@ -1318,6 +1533,7 @@
     <w:p>
       <w:pPr>
         <w:pStyle w:val="ListBullet"/>
+        <w:spacing w:line="312" w:lineRule="auto" w:after="0" w:before="0"/>
       </w:pPr>
       <w:r>
         <w:t>Token expiry: Monitored via middleware</w:t>
@@ -1325,6 +1541,9 @@
     </w:p>
     <w:p/>
     <w:p>
+      <w:pPr>
+        <w:spacing w:line="312" w:lineRule="auto" w:after="120"/>
+      </w:pPr>
       <w:r>
         <w:rPr>
           <w:b/>
@@ -1333,6 +1552,11 @@
       </w:r>
     </w:p>
     <w:p>
+      <w:pPr>
+        <w:pStyle w:val="IntenseQuote"/>
+        <w:spacing w:before="120" w:after="120"/>
+        <w:ind w:left="360"/>
+      </w:pPr>
       <w:r>
         <w:rPr>
           <w:rFonts w:ascii="Courier New" w:hAnsi="Courier New"/>
@@ -1390,6 +1614,9 @@
     </w:p>
     <w:p/>
     <w:p>
+      <w:pPr>
+        <w:spacing w:line="312" w:lineRule="auto" w:after="120"/>
+      </w:pPr>
       <w:r>
         <w:rPr>
           <w:b/>
@@ -1400,6 +1627,7 @@
     <w:p>
       <w:pPr>
         <w:pStyle w:val="ListBullet"/>
+        <w:spacing w:line="312" w:lineRule="auto" w:after="0" w:before="0"/>
       </w:pPr>
       <w:r>
         <w:t xml:space="preserve">Refresh access tokens when </w:t>
@@ -1417,6 +1645,7 @@
     <w:p>
       <w:pPr>
         <w:pStyle w:val="ListBullet"/>
+        <w:spacing w:line="312" w:lineRule="auto" w:after="0" w:before="0"/>
       </w:pPr>
       <w:r>
         <w:t>Implement automatic background refresh job</w:t>
@@ -1425,6 +1654,7 @@
     <w:p>
       <w:pPr>
         <w:pStyle w:val="ListBullet"/>
+        <w:spacing w:line="312" w:lineRule="auto" w:after="0" w:before="0"/>
       </w:pPr>
       <w:r>
         <w:t>Monitor refresh failures and alert on consecutive failures</w:t>
@@ -1433,18 +1663,27 @@
     <w:p/>
     <w:p/>
     <w:p>
+      <w:pPr>
+        <w:spacing w:line="312" w:lineRule="auto" w:after="120"/>
+      </w:pPr>
       <w:r>
         <w:t>## 3. Data Models &amp; Mapping</w:t>
       </w:r>
     </w:p>
     <w:p/>
     <w:p>
+      <w:pPr>
+        <w:spacing w:line="312" w:lineRule="auto" w:after="120"/>
+      </w:pPr>
       <w:r>
         <w:t>### 3.1 User Data Structure</w:t>
       </w:r>
     </w:p>
     <w:p/>
     <w:p>
+      <w:pPr>
+        <w:spacing w:line="312" w:lineRule="auto" w:after="120"/>
+      </w:pPr>
       <w:r>
         <w:rPr>
           <w:b/>
@@ -1453,6 +1692,11 @@
       </w:r>
     </w:p>
     <w:p>
+      <w:pPr>
+        <w:pStyle w:val="IntenseQuote"/>
+        <w:spacing w:before="120" w:after="120"/>
+        <w:ind w:left="360"/>
+      </w:pPr>
       <w:r>
         <w:rPr>
           <w:rFonts w:ascii="Courier New" w:hAnsi="Courier New"/>
@@ -1735,12 +1979,18 @@
     </w:p>
     <w:p/>
     <w:p>
+      <w:pPr>
+        <w:spacing w:line="312" w:lineRule="auto" w:after="120"/>
+      </w:pPr>
       <w:r>
         <w:t>### 3.2 MyGPS Mapping Strategy</w:t>
       </w:r>
     </w:p>
     <w:p/>
     <w:p>
+      <w:pPr>
+        <w:spacing w:line="312" w:lineRule="auto" w:after="120"/>
+      </w:pPr>
       <w:r>
         <w:rPr>
           <w:b/>
@@ -1751,6 +2001,7 @@
     <w:p>
       <w:pPr>
         <w:pStyle w:val="ListBullet"/>
+        <w:spacing w:line="312" w:lineRule="auto" w:after="0" w:before="0"/>
       </w:pPr>
       <w:r>
         <w:rPr>
@@ -1783,6 +2034,7 @@
     <w:p>
       <w:pPr>
         <w:pStyle w:val="ListBullet"/>
+        <w:spacing w:line="312" w:lineRule="auto" w:after="0" w:before="0"/>
       </w:pPr>
       <w:r>
         <w:rPr>
@@ -1812,6 +2064,7 @@
     <w:p>
       <w:pPr>
         <w:pStyle w:val="ListBullet"/>
+        <w:spacing w:line="312" w:lineRule="auto" w:after="0" w:before="0"/>
       </w:pPr>
       <w:r>
         <w:rPr>
@@ -1841,6 +2094,7 @@
     <w:p>
       <w:pPr>
         <w:pStyle w:val="ListBullet"/>
+        <w:spacing w:line="312" w:lineRule="auto" w:after="0" w:before="0"/>
       </w:pPr>
       <w:r>
         <w:rPr>
@@ -1863,6 +2117,9 @@
     </w:p>
     <w:p/>
     <w:p>
+      <w:pPr>
+        <w:spacing w:line="312" w:lineRule="auto" w:after="120"/>
+      </w:pPr>
       <w:r>
         <w:rPr>
           <w:b/>
@@ -1871,6 +2128,11 @@
       </w:r>
     </w:p>
     <w:p>
+      <w:pPr>
+        <w:pStyle w:val="IntenseQuote"/>
+        <w:spacing w:before="120" w:after="120"/>
+        <w:ind w:left="360"/>
+      </w:pPr>
       <w:r>
         <w:rPr>
           <w:rFonts w:ascii="Courier New" w:hAnsi="Courier New"/>
@@ -1969,12 +2231,18 @@
     </w:p>
     <w:p/>
     <w:p>
+      <w:pPr>
+        <w:spacing w:line="312" w:lineRule="auto" w:after="120"/>
+      </w:pPr>
       <w:r>
         <w:t>### 3.3 Data Transformation Rules</w:t>
       </w:r>
     </w:p>
     <w:p/>
     <w:p>
+      <w:pPr>
+        <w:spacing w:line="312" w:lineRule="auto" w:after="120"/>
+      </w:pPr>
       <w:r>
         <w:rPr>
           <w:b/>
@@ -1985,6 +2253,7 @@
     <w:p>
       <w:pPr>
         <w:pStyle w:val="ListBullet"/>
+        <w:spacing w:line="312" w:lineRule="auto" w:after="0" w:before="0"/>
       </w:pPr>
       <w:r>
         <w:rPr>
@@ -2005,6 +2274,7 @@
     <w:p>
       <w:pPr>
         <w:pStyle w:val="ListBullet"/>
+        <w:spacing w:line="312" w:lineRule="auto" w:after="0" w:before="0"/>
       </w:pPr>
       <w:r>
         <w:rPr>
@@ -2025,6 +2295,7 @@
     <w:p>
       <w:pPr>
         <w:pStyle w:val="ListBullet"/>
+        <w:spacing w:line="312" w:lineRule="auto" w:after="0" w:before="0"/>
       </w:pPr>
       <w:r>
         <w:rPr>
@@ -2045,6 +2316,7 @@
     <w:p>
       <w:pPr>
         <w:pStyle w:val="ListBullet"/>
+        <w:spacing w:line="312" w:lineRule="auto" w:after="0" w:before="0"/>
       </w:pPr>
       <w:r>
         <w:rPr>
@@ -2067,6 +2339,9 @@
     </w:p>
     <w:p/>
     <w:p>
+      <w:pPr>
+        <w:spacing w:line="312" w:lineRule="auto" w:after="120"/>
+      </w:pPr>
       <w:r>
         <w:rPr>
           <w:b/>
@@ -2077,6 +2352,7 @@
     <w:p>
       <w:pPr>
         <w:pStyle w:val="ListBullet"/>
+        <w:spacing w:line="312" w:lineRule="auto" w:after="0" w:before="0"/>
       </w:pPr>
       <w:r>
         <w:rPr>
@@ -2097,6 +2373,7 @@
     <w:p>
       <w:pPr>
         <w:pStyle w:val="ListBullet"/>
+        <w:spacing w:line="312" w:lineRule="auto" w:after="0" w:before="0"/>
       </w:pPr>
       <w:r>
         <w:rPr>
@@ -2117,6 +2394,7 @@
     <w:p>
       <w:pPr>
         <w:pStyle w:val="ListBullet"/>
+        <w:spacing w:line="312" w:lineRule="auto" w:after="0" w:before="0"/>
       </w:pPr>
       <w:r>
         <w:rPr>
@@ -2140,18 +2418,27 @@
     <w:p/>
     <w:p/>
     <w:p>
+      <w:pPr>
+        <w:spacing w:line="312" w:lineRule="auto" w:after="120"/>
+      </w:pPr>
       <w:r>
         <w:t>## 4. API Rate Limits &amp; Performance</w:t>
       </w:r>
     </w:p>
     <w:p/>
     <w:p>
+      <w:pPr>
+        <w:spacing w:line="312" w:lineRule="auto" w:after="120"/>
+      </w:pPr>
       <w:r>
         <w:t>### 4.1 Rate Limiting</w:t>
       </w:r>
     </w:p>
     <w:p/>
     <w:p>
+      <w:pPr>
+        <w:spacing w:line="312" w:lineRule="auto" w:after="120"/>
+      </w:pPr>
       <w:r>
         <w:rPr>
           <w:b/>
@@ -2162,6 +2449,7 @@
     <w:p>
       <w:pPr>
         <w:pStyle w:val="ListBullet"/>
+        <w:spacing w:line="312" w:lineRule="auto" w:after="0" w:before="0"/>
       </w:pPr>
       <w:r>
         <w:rPr>
@@ -2176,6 +2464,7 @@
     <w:p>
       <w:pPr>
         <w:pStyle w:val="ListBullet"/>
+        <w:spacing w:line="312" w:lineRule="auto" w:after="0" w:before="0"/>
       </w:pPr>
       <w:r>
         <w:rPr>
@@ -2190,6 +2479,7 @@
     <w:p>
       <w:pPr>
         <w:pStyle w:val="ListBullet"/>
+        <w:spacing w:line="312" w:lineRule="auto" w:after="0" w:before="0"/>
       </w:pPr>
       <w:r>
         <w:rPr>
@@ -2203,6 +2493,9 @@
     </w:p>
     <w:p/>
     <w:p>
+      <w:pPr>
+        <w:spacing w:line="312" w:lineRule="auto" w:after="120"/>
+      </w:pPr>
       <w:r>
         <w:rPr>
           <w:b/>
@@ -2211,6 +2504,11 @@
       </w:r>
     </w:p>
     <w:p>
+      <w:pPr>
+        <w:pStyle w:val="IntenseQuote"/>
+        <w:spacing w:before="120" w:after="120"/>
+        <w:ind w:left="360"/>
+      </w:pPr>
       <w:r>
         <w:rPr>
           <w:rFonts w:ascii="Courier New" w:hAnsi="Courier New"/>
@@ -2237,6 +2535,9 @@
     </w:p>
     <w:p/>
     <w:p>
+      <w:pPr>
+        <w:spacing w:line="312" w:lineRule="auto" w:after="120"/>
+      </w:pPr>
       <w:r>
         <w:rPr>
           <w:b/>
@@ -2247,6 +2548,7 @@
     <w:p>
       <w:pPr>
         <w:pStyle w:val="ListBullet"/>
+        <w:spacing w:line="312" w:lineRule="auto" w:after="0" w:before="0"/>
       </w:pPr>
       <w:r>
         <w:t>Implement exponential backoff on 429 (Too Many Requests) responses</w:t>
@@ -2255,6 +2557,7 @@
     <w:p>
       <w:pPr>
         <w:pStyle w:val="ListBullet"/>
+        <w:spacing w:line="312" w:lineRule="auto" w:after="0" w:before="0"/>
       </w:pPr>
       <w:r>
         <w:t>Use request queuing for bulk synchronization</w:t>
@@ -2263,6 +2566,7 @@
     <w:p>
       <w:pPr>
         <w:pStyle w:val="ListBullet"/>
+        <w:spacing w:line="312" w:lineRule="auto" w:after="0" w:before="0"/>
       </w:pPr>
       <w:r>
         <w:t>Cache frequently accessed data to reduce API calls</w:t>
@@ -2270,12 +2574,18 @@
     </w:p>
     <w:p/>
     <w:p>
+      <w:pPr>
+        <w:spacing w:line="312" w:lineRule="auto" w:after="120"/>
+      </w:pPr>
       <w:r>
         <w:t>### 4.2 Performance Considerations</w:t>
       </w:r>
     </w:p>
     <w:p/>
     <w:p>
+      <w:pPr>
+        <w:spacing w:line="312" w:lineRule="auto" w:after="120"/>
+      </w:pPr>
       <w:r>
         <w:rPr>
           <w:b/>
@@ -2286,6 +2596,7 @@
     <w:p>
       <w:pPr>
         <w:pStyle w:val="ListBullet"/>
+        <w:spacing w:line="312" w:lineRule="auto" w:after="0" w:before="0"/>
       </w:pPr>
       <w:r>
         <w:t>Authentication: &lt; 2 seconds</w:t>
@@ -2294,6 +2605,7 @@
     <w:p>
       <w:pPr>
         <w:pStyle w:val="ListBullet"/>
+        <w:spacing w:line="312" w:lineRule="auto" w:after="0" w:before="0"/>
       </w:pPr>
       <w:r>
         <w:t>User lookup: &lt; 1 second</w:t>
@@ -2302,6 +2614,7 @@
     <w:p>
       <w:pPr>
         <w:pStyle w:val="ListBullet"/>
+        <w:spacing w:line="312" w:lineRule="auto" w:after="0" w:before="0"/>
       </w:pPr>
       <w:r>
         <w:t>Roster sync: &lt; 5 seconds per 100 records</w:t>
@@ -2309,6 +2622,9 @@
     </w:p>
     <w:p/>
     <w:p>
+      <w:pPr>
+        <w:spacing w:line="312" w:lineRule="auto" w:after="120"/>
+      </w:pPr>
       <w:r>
         <w:rPr>
           <w:b/>
@@ -2319,6 +2635,7 @@
     <w:p>
       <w:pPr>
         <w:pStyle w:val="ListBullet"/>
+        <w:spacing w:line="312" w:lineRule="auto" w:after="0" w:before="0"/>
       </w:pPr>
       <w:r>
         <w:t>Batch requests where possible (ClassLink may support batch endpoints)</w:t>
@@ -2327,6 +2644,7 @@
     <w:p>
       <w:pPr>
         <w:pStyle w:val="ListBullet"/>
+        <w:spacing w:line="312" w:lineRule="auto" w:after="0" w:before="0"/>
       </w:pPr>
       <w:r>
         <w:t>Implement incremental sync (only fetch modified records since last sync)</w:t>
@@ -2335,6 +2653,7 @@
     <w:p>
       <w:pPr>
         <w:pStyle w:val="ListBullet"/>
+        <w:spacing w:line="312" w:lineRule="auto" w:after="0" w:before="0"/>
       </w:pPr>
       <w:r>
         <w:t xml:space="preserve">Use </w:t>
@@ -2352,6 +2671,7 @@
     <w:p>
       <w:pPr>
         <w:pStyle w:val="ListBullet"/>
+        <w:spacing w:line="312" w:lineRule="auto" w:after="0" w:before="0"/>
       </w:pPr>
       <w:r>
         <w:t>Cache organization/tenant data (changes infrequently)</w:t>
@@ -2359,6 +2679,9 @@
     </w:p>
     <w:p/>
     <w:p>
+      <w:pPr>
+        <w:spacing w:line="312" w:lineRule="auto" w:after="120"/>
+      </w:pPr>
       <w:r>
         <w:rPr>
           <w:b/>
@@ -2369,6 +2692,7 @@
     <w:p>
       <w:pPr>
         <w:pStyle w:val="ListBullet"/>
+        <w:spacing w:line="312" w:lineRule="auto" w:after="0" w:before="0"/>
       </w:pPr>
       <w:r>
         <w:t>Default page size: 100 records</w:t>
@@ -2377,6 +2701,7 @@
     <w:p>
       <w:pPr>
         <w:pStyle w:val="ListBullet"/>
+        <w:spacing w:line="312" w:lineRule="auto" w:after="0" w:before="0"/>
       </w:pPr>
       <w:r>
         <w:t>Maximum page size: 1000 records</w:t>
@@ -2385,6 +2710,7 @@
     <w:p>
       <w:pPr>
         <w:pStyle w:val="ListBullet"/>
+        <w:spacing w:line="312" w:lineRule="auto" w:after="0" w:before="0"/>
       </w:pPr>
       <w:r>
         <w:t>Implement cursor-based or offset-based pagination as supported</w:t>
@@ -2393,18 +2719,27 @@
     <w:p/>
     <w:p/>
     <w:p>
+      <w:pPr>
+        <w:spacing w:line="312" w:lineRule="auto" w:after="120"/>
+      </w:pPr>
       <w:r>
         <w:t>## 5. Security Requirements</w:t>
       </w:r>
     </w:p>
     <w:p/>
     <w:p>
+      <w:pPr>
+        <w:spacing w:line="312" w:lineRule="auto" w:after="120"/>
+      </w:pPr>
       <w:r>
         <w:t>### 5.1 SSL/TLS Requirements</w:t>
       </w:r>
     </w:p>
     <w:p/>
     <w:p>
+      <w:pPr>
+        <w:spacing w:line="312" w:lineRule="auto" w:after="120"/>
+      </w:pPr>
       <w:r>
         <w:rPr>
           <w:b/>
@@ -2415,6 +2750,7 @@
     <w:p>
       <w:pPr>
         <w:pStyle w:val="ListBullet"/>
+        <w:spacing w:line="312" w:lineRule="auto" w:after="0" w:before="0"/>
       </w:pPr>
       <w:r>
         <w:t>All API calls must use HTTPS (TLS 1.2 or higher)</w:t>
@@ -2423,6 +2759,7 @@
     <w:p>
       <w:pPr>
         <w:pStyle w:val="ListBullet"/>
+        <w:spacing w:line="312" w:lineRule="auto" w:after="0" w:before="0"/>
       </w:pPr>
       <w:r>
         <w:t>Valid SSL certificates required for callback URLs</w:t>
@@ -2431,6 +2768,7 @@
     <w:p>
       <w:pPr>
         <w:pStyle w:val="ListBullet"/>
+        <w:spacing w:line="312" w:lineRule="auto" w:after="0" w:before="0"/>
       </w:pPr>
       <w:r>
         <w:t>Certificate pinning recommended for production</w:t>
@@ -2438,6 +2776,9 @@
     </w:p>
     <w:p/>
     <w:p>
+      <w:pPr>
+        <w:spacing w:line="312" w:lineRule="auto" w:after="120"/>
+      </w:pPr>
       <w:r>
         <w:rPr>
           <w:b/>
@@ -2448,6 +2789,7 @@
     <w:p>
       <w:pPr>
         <w:pStyle w:val="ListBullet"/>
+        <w:spacing w:line="312" w:lineRule="auto" w:after="0" w:before="0"/>
       </w:pPr>
       <w:r>
         <w:t>Automated certificate renewal monitoring</w:t>
@@ -2456,6 +2798,7 @@
     <w:p>
       <w:pPr>
         <w:pStyle w:val="ListBullet"/>
+        <w:spacing w:line="312" w:lineRule="auto" w:after="0" w:before="0"/>
       </w:pPr>
       <w:r>
         <w:t>Alert on certificate expiration (&lt; 30 days remaining)</w:t>
@@ -2464,6 +2807,7 @@
     <w:p>
       <w:pPr>
         <w:pStyle w:val="ListBullet"/>
+        <w:spacing w:line="312" w:lineRule="auto" w:after="0" w:before="0"/>
       </w:pPr>
       <w:r>
         <w:t>Use certificate management tools (Let's Encrypt, AWS Certificate Manager, etc.)</w:t>
@@ -2471,12 +2815,18 @@
     </w:p>
     <w:p/>
     <w:p>
+      <w:pPr>
+        <w:spacing w:line="312" w:lineRule="auto" w:after="120"/>
+      </w:pPr>
       <w:r>
         <w:t>### 5.2 Data Protection</w:t>
       </w:r>
     </w:p>
     <w:p/>
     <w:p>
+      <w:pPr>
+        <w:spacing w:line="312" w:lineRule="auto" w:after="120"/>
+      </w:pPr>
       <w:r>
         <w:rPr>
           <w:b/>
@@ -2487,6 +2837,7 @@
     <w:p>
       <w:pPr>
         <w:pStyle w:val="ListBullet"/>
+        <w:spacing w:line="312" w:lineRule="auto" w:after="0" w:before="0"/>
       </w:pPr>
       <w:r>
         <w:t>All PII data encrypted in transit (HTTPS)</w:t>
@@ -2495,6 +2846,7 @@
     <w:p>
       <w:pPr>
         <w:pStyle w:val="ListBullet"/>
+        <w:spacing w:line="312" w:lineRule="auto" w:after="0" w:before="0"/>
       </w:pPr>
       <w:r>
         <w:t>All PII data encrypted at rest in MyGPS database</w:t>
@@ -2503,6 +2855,7 @@
     <w:p>
       <w:pPr>
         <w:pStyle w:val="ListBullet"/>
+        <w:spacing w:line="312" w:lineRule="auto" w:after="0" w:before="0"/>
       </w:pPr>
       <w:r>
         <w:t>Logging: Exclude PII from application logs</w:t>
@@ -2511,6 +2864,7 @@
     <w:p>
       <w:pPr>
         <w:pStyle w:val="ListBullet"/>
+        <w:spacing w:line="312" w:lineRule="auto" w:after="0" w:before="0"/>
       </w:pPr>
       <w:r>
         <w:t>Audit trail: Log all data access operations</w:t>
@@ -2518,6 +2872,9 @@
     </w:p>
     <w:p/>
     <w:p>
+      <w:pPr>
+        <w:spacing w:line="312" w:lineRule="auto" w:after="120"/>
+      </w:pPr>
       <w:r>
         <w:rPr>
           <w:b/>
@@ -2528,6 +2885,7 @@
     <w:p>
       <w:pPr>
         <w:pStyle w:val="ListBullet"/>
+        <w:spacing w:line="312" w:lineRule="auto" w:after="0" w:before="0"/>
       </w:pPr>
       <w:r>
         <w:t>Implement request signature validation (if ClassLink provides)</w:t>
@@ -2536,6 +2894,7 @@
     <w:p>
       <w:pPr>
         <w:pStyle w:val="ListBullet"/>
+        <w:spacing w:line="312" w:lineRule="auto" w:after="0" w:before="0"/>
       </w:pPr>
       <w:r>
         <w:t>Validate JWT tokens (if using OpenID Connect)</w:t>
@@ -2544,6 +2903,7 @@
     <w:p>
       <w:pPr>
         <w:pStyle w:val="ListBullet"/>
+        <w:spacing w:line="312" w:lineRule="auto" w:after="0" w:before="0"/>
       </w:pPr>
       <w:r>
         <w:t>Verify token signatures using ClassLink's public keys</w:t>
@@ -2551,12 +2911,18 @@
     </w:p>
     <w:p/>
     <w:p>
+      <w:pPr>
+        <w:spacing w:line="312" w:lineRule="auto" w:after="120"/>
+      </w:pPr>
       <w:r>
         <w:t>### 5.3 Access Control</w:t>
       </w:r>
     </w:p>
     <w:p/>
     <w:p>
+      <w:pPr>
+        <w:spacing w:line="312" w:lineRule="auto" w:after="120"/>
+      </w:pPr>
       <w:r>
         <w:rPr>
           <w:b/>
@@ -2567,6 +2933,7 @@
     <w:p>
       <w:pPr>
         <w:pStyle w:val="ListBullet"/>
+        <w:spacing w:line="312" w:lineRule="auto" w:after="0" w:before="0"/>
       </w:pPr>
       <w:r>
         <w:t>Request minimal required scopes only</w:t>
@@ -2575,6 +2942,7 @@
     <w:p>
       <w:pPr>
         <w:pStyle w:val="ListBullet"/>
+        <w:spacing w:line="312" w:lineRule="auto" w:after="0" w:before="0"/>
       </w:pPr>
       <w:r>
         <w:t>Regularly audit scope usage</w:t>
@@ -2583,6 +2951,7 @@
     <w:p>
       <w:pPr>
         <w:pStyle w:val="ListBullet"/>
+        <w:spacing w:line="312" w:lineRule="auto" w:after="0" w:before="0"/>
       </w:pPr>
       <w:r>
         <w:t>Implement scope-based access control in MyGPS</w:t>
@@ -2590,6 +2959,9 @@
     </w:p>
     <w:p/>
     <w:p>
+      <w:pPr>
+        <w:spacing w:line="312" w:lineRule="auto" w:after="120"/>
+      </w:pPr>
       <w:r>
         <w:rPr>
           <w:b/>
@@ -2600,6 +2972,7 @@
     <w:p>
       <w:pPr>
         <w:pStyle w:val="ListBullet"/>
+        <w:spacing w:line="312" w:lineRule="auto" w:after="0" w:before="0"/>
       </w:pPr>
       <w:r>
         <w:t>Store tokens in encrypted database fields</w:t>
@@ -2608,6 +2981,7 @@
     <w:p>
       <w:pPr>
         <w:pStyle w:val="ListBullet"/>
+        <w:spacing w:line="312" w:lineRule="auto" w:after="0" w:before="0"/>
       </w:pPr>
       <w:r>
         <w:t>Use secure key management (AWS KMS, Azure Key Vault, etc.)</w:t>
@@ -2616,6 +2990,7 @@
     <w:p>
       <w:pPr>
         <w:pStyle w:val="ListBullet"/>
+        <w:spacing w:line="312" w:lineRule="auto" w:after="0" w:before="0"/>
       </w:pPr>
       <w:r>
         <w:t>Rotate client secrets periodically</w:t>
@@ -2624,6 +2999,7 @@
     <w:p>
       <w:pPr>
         <w:pStyle w:val="ListBullet"/>
+        <w:spacing w:line="312" w:lineRule="auto" w:after="0" w:before="0"/>
       </w:pPr>
       <w:r>
         <w:t>Never expose tokens in client-side code or logs</w:t>
@@ -2632,18 +3008,27 @@
     <w:p/>
     <w:p/>
     <w:p>
+      <w:pPr>
+        <w:spacing w:line="312" w:lineRule="auto" w:after="120"/>
+      </w:pPr>
       <w:r>
         <w:t>## 6. Error Handling &amp; Resilience</w:t>
       </w:r>
     </w:p>
     <w:p/>
     <w:p>
+      <w:pPr>
+        <w:spacing w:line="312" w:lineRule="auto" w:after="120"/>
+      </w:pPr>
       <w:r>
         <w:t>### 6.1 API Error Responses</w:t>
       </w:r>
     </w:p>
     <w:p/>
     <w:p>
+      <w:pPr>
+        <w:spacing w:line="312" w:lineRule="auto" w:after="120"/>
+      </w:pPr>
       <w:r>
         <w:rPr>
           <w:b/>
@@ -2654,6 +3039,7 @@
     <w:p>
       <w:pPr>
         <w:pStyle w:val="ListBullet"/>
+        <w:spacing w:line="312" w:lineRule="auto" w:after="0" w:before="0"/>
       </w:pPr>
       <w:r>
         <w:rPr>
@@ -2668,6 +3054,7 @@
     <w:p>
       <w:pPr>
         <w:pStyle w:val="ListBullet"/>
+        <w:spacing w:line="312" w:lineRule="auto" w:after="0" w:before="0"/>
       </w:pPr>
       <w:r>
         <w:rPr>
@@ -2682,6 +3069,7 @@
     <w:p>
       <w:pPr>
         <w:pStyle w:val="ListBullet"/>
+        <w:spacing w:line="312" w:lineRule="auto" w:after="0" w:before="0"/>
       </w:pPr>
       <w:r>
         <w:rPr>
@@ -2696,6 +3084,7 @@
     <w:p>
       <w:pPr>
         <w:pStyle w:val="ListBullet"/>
+        <w:spacing w:line="312" w:lineRule="auto" w:after="0" w:before="0"/>
       </w:pPr>
       <w:r>
         <w:rPr>
@@ -2710,6 +3099,7 @@
     <w:p>
       <w:pPr>
         <w:pStyle w:val="ListBullet"/>
+        <w:spacing w:line="312" w:lineRule="auto" w:after="0" w:before="0"/>
       </w:pPr>
       <w:r>
         <w:rPr>
@@ -2724,6 +3114,7 @@
     <w:p>
       <w:pPr>
         <w:pStyle w:val="ListBullet"/>
+        <w:spacing w:line="312" w:lineRule="auto" w:after="0" w:before="0"/>
       </w:pPr>
       <w:r>
         <w:rPr>
@@ -2738,6 +3129,7 @@
     <w:p>
       <w:pPr>
         <w:pStyle w:val="ListBullet"/>
+        <w:spacing w:line="312" w:lineRule="auto" w:after="0" w:before="0"/>
       </w:pPr>
       <w:r>
         <w:rPr>
@@ -2752,6 +3144,7 @@
     <w:p>
       <w:pPr>
         <w:pStyle w:val="ListBullet"/>
+        <w:spacing w:line="312" w:lineRule="auto" w:after="0" w:before="0"/>
       </w:pPr>
       <w:r>
         <w:rPr>
@@ -2765,6 +3158,9 @@
     </w:p>
     <w:p/>
     <w:p>
+      <w:pPr>
+        <w:spacing w:line="312" w:lineRule="auto" w:after="120"/>
+      </w:pPr>
       <w:r>
         <w:rPr>
           <w:b/>
@@ -2773,6 +3169,11 @@
       </w:r>
     </w:p>
     <w:p>
+      <w:pPr>
+        <w:pStyle w:val="IntenseQuote"/>
+        <w:spacing w:before="120" w:after="120"/>
+        <w:ind w:left="360"/>
+      </w:pPr>
       <w:r>
         <w:rPr>
           <w:rFonts w:ascii="Courier New" w:hAnsi="Courier New"/>
@@ -2815,12 +3216,18 @@
     </w:p>
     <w:p/>
     <w:p>
+      <w:pPr>
+        <w:spacing w:line="312" w:lineRule="auto" w:after="120"/>
+      </w:pPr>
       <w:r>
         <w:t>### 6.2 Retry Strategy</w:t>
       </w:r>
     </w:p>
     <w:p/>
     <w:p>
+      <w:pPr>
+        <w:spacing w:line="312" w:lineRule="auto" w:after="120"/>
+      </w:pPr>
       <w:r>
         <w:rPr>
           <w:b/>
@@ -2831,6 +3238,7 @@
     <w:p>
       <w:pPr>
         <w:pStyle w:val="ListBullet"/>
+        <w:spacing w:line="312" w:lineRule="auto" w:after="0" w:before="0"/>
       </w:pPr>
       <w:r>
         <w:rPr>
@@ -2845,6 +3253,7 @@
     <w:p>
       <w:pPr>
         <w:pStyle w:val="ListBullet"/>
+        <w:spacing w:line="312" w:lineRule="auto" w:after="0" w:before="0"/>
       </w:pPr>
       <w:r>
         <w:rPr>
@@ -2868,6 +3277,7 @@
     <w:p>
       <w:pPr>
         <w:pStyle w:val="ListBullet"/>
+        <w:spacing w:line="312" w:lineRule="auto" w:after="0" w:before="0"/>
       </w:pPr>
       <w:r>
         <w:rPr>
@@ -2882,6 +3292,7 @@
     <w:p>
       <w:pPr>
         <w:pStyle w:val="ListBullet"/>
+        <w:spacing w:line="312" w:lineRule="auto" w:after="0" w:before="0"/>
       </w:pPr>
       <w:r>
         <w:rPr>
@@ -2895,6 +3306,9 @@
     </w:p>
     <w:p/>
     <w:p>
+      <w:pPr>
+        <w:spacing w:line="312" w:lineRule="auto" w:after="120"/>
+      </w:pPr>
       <w:r>
         <w:rPr>
           <w:b/>
@@ -2905,6 +3319,7 @@
     <w:p>
       <w:pPr>
         <w:pStyle w:val="ListBullet"/>
+        <w:spacing w:line="312" w:lineRule="auto" w:after="0" w:before="0"/>
       </w:pPr>
       <w:r>
         <w:t>Attempt 1: Immediate</w:t>
@@ -2913,6 +3328,7 @@
     <w:p>
       <w:pPr>
         <w:pStyle w:val="ListBullet"/>
+        <w:spacing w:line="312" w:lineRule="auto" w:after="0" w:before="0"/>
       </w:pPr>
       <w:r>
         <w:t>Attempt 2: 1 second delay</w:t>
@@ -2921,6 +3337,7 @@
     <w:p>
       <w:pPr>
         <w:pStyle w:val="ListBullet"/>
+        <w:spacing w:line="312" w:lineRule="auto" w:after="0" w:before="0"/>
       </w:pPr>
       <w:r>
         <w:t>Attempt 3: 2 seconds delay</w:t>
@@ -2929,6 +3346,7 @@
     <w:p>
       <w:pPr>
         <w:pStyle w:val="ListBullet"/>
+        <w:spacing w:line="312" w:lineRule="auto" w:after="0" w:before="0"/>
       </w:pPr>
       <w:r>
         <w:t>Attempt 4: 4 seconds delay</w:t>
@@ -2936,12 +3354,18 @@
     </w:p>
     <w:p/>
     <w:p>
+      <w:pPr>
+        <w:spacing w:line="312" w:lineRule="auto" w:after="120"/>
+      </w:pPr>
       <w:r>
         <w:t>### 6.3 Fallback Mechanisms</w:t>
       </w:r>
     </w:p>
     <w:p/>
     <w:p>
+      <w:pPr>
+        <w:spacing w:line="312" w:lineRule="auto" w:after="120"/>
+      </w:pPr>
       <w:r>
         <w:rPr>
           <w:b/>
@@ -2952,6 +3376,7 @@
     <w:p>
       <w:pPr>
         <w:pStyle w:val="ListBullet"/>
+        <w:spacing w:line="312" w:lineRule="auto" w:after="0" w:before="0"/>
       </w:pPr>
       <w:r>
         <w:t>If ClassLink SSO fails, allow users to authenticate with MyGPS credentials</w:t>
@@ -2960,6 +3385,7 @@
     <w:p>
       <w:pPr>
         <w:pStyle w:val="ListBullet"/>
+        <w:spacing w:line="312" w:lineRule="auto" w:after="0" w:before="0"/>
       </w:pPr>
       <w:r>
         <w:t>Display clear error message: "ClassLink authentication unavailable. Please use your MyGPS credentials."</w:t>
@@ -2968,6 +3394,7 @@
     <w:p>
       <w:pPr>
         <w:pStyle w:val="ListBullet"/>
+        <w:spacing w:line="312" w:lineRule="auto" w:after="0" w:before="0"/>
       </w:pPr>
       <w:r>
         <w:t>Automatically retry ClassLink authentication on next login attempt</w:t>
@@ -2975,6 +3402,9 @@
     </w:p>
     <w:p/>
     <w:p>
+      <w:pPr>
+        <w:spacing w:line="312" w:lineRule="auto" w:after="120"/>
+      </w:pPr>
       <w:r>
         <w:rPr>
           <w:b/>
@@ -2985,6 +3415,7 @@
     <w:p>
       <w:pPr>
         <w:pStyle w:val="ListBullet"/>
+        <w:spacing w:line="312" w:lineRule="auto" w:after="0" w:before="0"/>
       </w:pPr>
       <w:r>
         <w:t>If roster sync fails, continue using last known good data</w:t>
@@ -2993,6 +3424,7 @@
     <w:p>
       <w:pPr>
         <w:pStyle w:val="ListBullet"/>
+        <w:spacing w:line="312" w:lineRule="auto" w:after="0" w:before="0"/>
       </w:pPr>
       <w:r>
         <w:t>Queue failed sync operations for retry</w:t>
@@ -3001,6 +3433,7 @@
     <w:p>
       <w:pPr>
         <w:pStyle w:val="ListBullet"/>
+        <w:spacing w:line="312" w:lineRule="auto" w:after="0" w:before="0"/>
       </w:pPr>
       <w:r>
         <w:t>Alert administrators on sync failures &gt; 3 consecutive attempts</w:t>
@@ -3008,6 +3441,9 @@
     </w:p>
     <w:p/>
     <w:p>
+      <w:pPr>
+        <w:spacing w:line="312" w:lineRule="auto" w:after="120"/>
+      </w:pPr>
       <w:r>
         <w:rPr>
           <w:b/>
@@ -3018,6 +3454,7 @@
     <w:p>
       <w:pPr>
         <w:pStyle w:val="ListBullet"/>
+        <w:spacing w:line="312" w:lineRule="auto" w:after="0" w:before="0"/>
       </w:pPr>
       <w:r>
         <w:t>Real-time API health monitoring</w:t>
@@ -3026,6 +3463,7 @@
     <w:p>
       <w:pPr>
         <w:pStyle w:val="ListBullet"/>
+        <w:spacing w:line="312" w:lineRule="auto" w:after="0" w:before="0"/>
       </w:pPr>
       <w:r>
         <w:t>Alert on API downtime &gt; 5 minutes</w:t>
@@ -3034,6 +3472,7 @@
     <w:p>
       <w:pPr>
         <w:pStyle w:val="ListBullet"/>
+        <w:spacing w:line="312" w:lineRule="auto" w:after="0" w:before="0"/>
       </w:pPr>
       <w:r>
         <w:t>Alert on authentication failure rate &gt; 5%</w:t>
@@ -3042,6 +3481,7 @@
     <w:p>
       <w:pPr>
         <w:pStyle w:val="ListBullet"/>
+        <w:spacing w:line="312" w:lineRule="auto" w:after="0" w:before="0"/>
       </w:pPr>
       <w:r>
         <w:t>Alert on sync failure rate &gt; 10%</w:t>
@@ -3050,18 +3490,27 @@
     <w:p/>
     <w:p/>
     <w:p>
+      <w:pPr>
+        <w:spacing w:line="312" w:lineRule="auto" w:after="120"/>
+      </w:pPr>
       <w:r>
         <w:t>## 7. Integration Implementation Details</w:t>
       </w:r>
     </w:p>
     <w:p/>
     <w:p>
+      <w:pPr>
+        <w:spacing w:line="312" w:lineRule="auto" w:after="120"/>
+      </w:pPr>
       <w:r>
         <w:t>### 7.1 Scheduled Synchronization Job</w:t>
       </w:r>
     </w:p>
     <w:p/>
     <w:p>
+      <w:pPr>
+        <w:spacing w:line="312" w:lineRule="auto" w:after="120"/>
+      </w:pPr>
       <w:r>
         <w:rPr>
           <w:b/>
@@ -3072,6 +3521,7 @@
     <w:p>
       <w:pPr>
         <w:pStyle w:val="ListBullet"/>
+        <w:spacing w:line="312" w:lineRule="auto" w:after="0" w:before="0"/>
       </w:pPr>
       <w:r>
         <w:rPr>
@@ -3086,6 +3536,7 @@
     <w:p>
       <w:pPr>
         <w:pStyle w:val="ListBullet"/>
+        <w:spacing w:line="312" w:lineRule="auto" w:after="0" w:before="0"/>
       </w:pPr>
       <w:r>
         <w:rPr>
@@ -3100,6 +3551,7 @@
     <w:p>
       <w:pPr>
         <w:pStyle w:val="ListBullet"/>
+        <w:spacing w:line="312" w:lineRule="auto" w:after="0" w:before="0"/>
       </w:pPr>
       <w:r>
         <w:rPr>
@@ -3113,6 +3565,9 @@
     </w:p>
     <w:p/>
     <w:p>
+      <w:pPr>
+        <w:spacing w:line="312" w:lineRule="auto" w:after="120"/>
+      </w:pPr>
       <w:r>
         <w:rPr>
           <w:b/>
@@ -3123,6 +3578,7 @@
     <w:p>
       <w:pPr>
         <w:pStyle w:val="ListNumber"/>
+        <w:spacing w:line="312" w:lineRule="auto" w:after="0" w:before="0"/>
       </w:pPr>
       <w:r>
         <w:t>Authenticate with ClassLink using client credentials</w:t>
@@ -3131,6 +3587,7 @@
     <w:p>
       <w:pPr>
         <w:pStyle w:val="ListNumber"/>
+        <w:spacing w:line="312" w:lineRule="auto" w:after="0" w:before="0"/>
       </w:pPr>
       <w:r>
         <w:t>Fetch modified records since last sync timestamp</w:t>
@@ -3139,6 +3596,7 @@
     <w:p>
       <w:pPr>
         <w:pStyle w:val="ListNumber"/>
+        <w:spacing w:line="312" w:lineRule="auto" w:after="0" w:before="0"/>
       </w:pPr>
       <w:r>
         <w:t>Transform data to MyGPS format</w:t>
@@ -3147,6 +3605,7 @@
     <w:p>
       <w:pPr>
         <w:pStyle w:val="ListNumber"/>
+        <w:spacing w:line="312" w:lineRule="auto" w:after="0" w:before="0"/>
       </w:pPr>
       <w:r>
         <w:t>Validate data integrity (checksums, required fields)</w:t>
@@ -3155,6 +3614,7 @@
     <w:p>
       <w:pPr>
         <w:pStyle w:val="ListNumber"/>
+        <w:spacing w:line="312" w:lineRule="auto" w:after="0" w:before="0"/>
       </w:pPr>
       <w:r>
         <w:t>Upsert records in MyGPS database</w:t>
@@ -3163,6 +3623,7 @@
     <w:p>
       <w:pPr>
         <w:pStyle w:val="ListNumber"/>
+        <w:spacing w:line="312" w:lineRule="auto" w:after="0" w:before="0"/>
       </w:pPr>
       <w:r>
         <w:t>Update sync metadata (last sync timestamp, record counts)</w:t>
@@ -3171,6 +3632,7 @@
     <w:p>
       <w:pPr>
         <w:pStyle w:val="ListNumber"/>
+        <w:spacing w:line="312" w:lineRule="auto" w:after="0" w:before="0"/>
       </w:pPr>
       <w:r>
         <w:t>Log sync results and errors</w:t>
@@ -3178,6 +3640,9 @@
     </w:p>
     <w:p/>
     <w:p>
+      <w:pPr>
+        <w:spacing w:line="312" w:lineRule="auto" w:after="120"/>
+      </w:pPr>
       <w:r>
         <w:rPr>
           <w:b/>
@@ -3186,6 +3651,11 @@
       </w:r>
     </w:p>
     <w:p>
+      <w:pPr>
+        <w:pStyle w:val="IntenseQuote"/>
+        <w:spacing w:before="120" w:after="120"/>
+        <w:ind w:left="360"/>
+      </w:pPr>
       <w:r>
         <w:rPr>
           <w:rFonts w:ascii="Courier New" w:hAnsi="Courier New"/>
@@ -3276,12 +3746,18 @@
     </w:p>
     <w:p/>
     <w:p>
+      <w:pPr>
+        <w:spacing w:line="312" w:lineRule="auto" w:after="120"/>
+      </w:pPr>
       <w:r>
         <w:t>### 7.2 API Client Implementation</w:t>
       </w:r>
     </w:p>
     <w:p/>
     <w:p>
+      <w:pPr>
+        <w:spacing w:line="312" w:lineRule="auto" w:after="120"/>
+      </w:pPr>
       <w:r>
         <w:rPr>
           <w:b/>
@@ -3292,6 +3768,7 @@
     <w:p>
       <w:pPr>
         <w:pStyle w:val="ListBullet"/>
+        <w:spacing w:line="312" w:lineRule="auto" w:after="0" w:before="0"/>
       </w:pPr>
       <w:r>
         <w:rPr>
@@ -3333,6 +3810,7 @@
     <w:p>
       <w:pPr>
         <w:pStyle w:val="ListBullet"/>
+        <w:spacing w:line="312" w:lineRule="auto" w:after="0" w:before="0"/>
       </w:pPr>
       <w:r>
         <w:rPr>
@@ -3365,6 +3843,7 @@
     <w:p>
       <w:pPr>
         <w:pStyle w:val="ListBullet"/>
+        <w:spacing w:line="312" w:lineRule="auto" w:after="0" w:before="0"/>
       </w:pPr>
       <w:r>
         <w:rPr>
@@ -3405,6 +3884,9 @@
     </w:p>
     <w:p/>
     <w:p>
+      <w:pPr>
+        <w:spacing w:line="312" w:lineRule="auto" w:after="120"/>
+      </w:pPr>
       <w:r>
         <w:rPr>
           <w:b/>
@@ -3413,6 +3895,11 @@
       </w:r>
     </w:p>
     <w:p>
+      <w:pPr>
+        <w:pStyle w:val="IntenseQuote"/>
+        <w:spacing w:before="120" w:after="120"/>
+        <w:ind w:left="360"/>
+      </w:pPr>
       <w:r>
         <w:rPr>
           <w:rFonts w:ascii="Courier New" w:hAnsi="Courier New"/>
@@ -3642,12 +4129,18 @@
     </w:p>
     <w:p/>
     <w:p>
+      <w:pPr>
+        <w:spacing w:line="312" w:lineRule="auto" w:after="120"/>
+      </w:pPr>
       <w:r>
         <w:t>### 7.3 Database Schema Extensions</w:t>
       </w:r>
     </w:p>
     <w:p/>
     <w:p>
+      <w:pPr>
+        <w:spacing w:line="312" w:lineRule="auto" w:after="120"/>
+      </w:pPr>
       <w:r>
         <w:rPr>
           <w:b/>
@@ -3657,6 +4150,11 @@
     </w:p>
     <w:p/>
     <w:p>
+      <w:pPr>
+        <w:pStyle w:val="IntenseQuote"/>
+        <w:spacing w:before="120" w:after="120"/>
+        <w:ind w:left="360"/>
+      </w:pPr>
       <w:r>
         <w:rPr>
           <w:rFonts w:ascii="Courier New" w:hAnsi="Courier New"/>
@@ -3961,18 +4459,27 @@
     <w:p/>
     <w:p/>
     <w:p>
+      <w:pPr>
+        <w:spacing w:line="312" w:lineRule="auto" w:after="120"/>
+      </w:pPr>
       <w:r>
         <w:t>## 8. Testing &amp; Validation</w:t>
       </w:r>
     </w:p>
     <w:p/>
     <w:p>
+      <w:pPr>
+        <w:spacing w:line="312" w:lineRule="auto" w:after="120"/>
+      </w:pPr>
       <w:r>
         <w:t>### 8.1 API Testing Checklist</w:t>
       </w:r>
     </w:p>
     <w:p/>
     <w:p>
+      <w:pPr>
+        <w:spacing w:line="312" w:lineRule="auto" w:after="120"/>
+      </w:pPr>
       <w:r>
         <w:rPr>
           <w:b/>
@@ -3983,6 +4490,7 @@
     <w:p>
       <w:pPr>
         <w:pStyle w:val="ListBullet"/>
+        <w:spacing w:line="312" w:lineRule="auto" w:after="0" w:before="0"/>
       </w:pPr>
       <w:r>
         <w:t>[ ] OAuth2 authorization flow completes successfully</w:t>
@@ -3991,6 +4499,7 @@
     <w:p>
       <w:pPr>
         <w:pStyle w:val="ListBullet"/>
+        <w:spacing w:line="312" w:lineRule="auto" w:after="0" w:before="0"/>
       </w:pPr>
       <w:r>
         <w:t>[ ] Token exchange returns valid access and refresh tokens</w:t>
@@ -3999,6 +4508,7 @@
     <w:p>
       <w:pPr>
         <w:pStyle w:val="ListBullet"/>
+        <w:spacing w:line="312" w:lineRule="auto" w:after="0" w:before="0"/>
       </w:pPr>
       <w:r>
         <w:t>[ ] Token refresh works before and after expiration</w:t>
@@ -4007,6 +4517,7 @@
     <w:p>
       <w:pPr>
         <w:pStyle w:val="ListBullet"/>
+        <w:spacing w:line="312" w:lineRule="auto" w:after="0" w:before="0"/>
       </w:pPr>
       <w:r>
         <w:t>[ ] Invalid credentials return appropriate error codes</w:t>
@@ -4015,6 +4526,7 @@
     <w:p>
       <w:pPr>
         <w:pStyle w:val="ListBullet"/>
+        <w:spacing w:line="312" w:lineRule="auto" w:after="0" w:before="0"/>
       </w:pPr>
       <w:r>
         <w:t>[ ] Expired tokens are rejected with 401</w:t>
@@ -4022,6 +4534,9 @@
     </w:p>
     <w:p/>
     <w:p>
+      <w:pPr>
+        <w:spacing w:line="312" w:lineRule="auto" w:after="120"/>
+      </w:pPr>
       <w:r>
         <w:rPr>
           <w:b/>
@@ -4032,6 +4547,7 @@
     <w:p>
       <w:pPr>
         <w:pStyle w:val="ListBullet"/>
+        <w:spacing w:line="312" w:lineRule="auto" w:after="0" w:before="0"/>
       </w:pPr>
       <w:r>
         <w:t>[ ] User info endpoint returns correct user data</w:t>
@@ -4040,6 +4556,7 @@
     <w:p>
       <w:pPr>
         <w:pStyle w:val="ListBullet"/>
+        <w:spacing w:line="312" w:lineRule="auto" w:after="0" w:before="0"/>
       </w:pPr>
       <w:r>
         <w:t>[ ] Roster endpoint returns paginated user list</w:t>
@@ -4048,6 +4565,7 @@
     <w:p>
       <w:pPr>
         <w:pStyle w:val="ListBullet"/>
+        <w:spacing w:line="312" w:lineRule="auto" w:after="0" w:before="0"/>
       </w:pPr>
       <w:r>
         <w:t>[ ] Single user lookup by SourcedId works</w:t>
@@ -4056,6 +4574,7 @@
     <w:p>
       <w:pPr>
         <w:pStyle w:val="ListBullet"/>
+        <w:spacing w:line="312" w:lineRule="auto" w:after="0" w:before="0"/>
       </w:pPr>
       <w:r>
         <w:t>[ ] Organization data retrieval works</w:t>
@@ -4064,6 +4583,7 @@
     <w:p>
       <w:pPr>
         <w:pStyle w:val="ListBullet"/>
+        <w:spacing w:line="312" w:lineRule="auto" w:after="0" w:before="0"/>
       </w:pPr>
       <w:r>
         <w:t>[ ] Class/section data retrieval works</w:t>
@@ -4072,6 +4592,7 @@
     <w:p>
       <w:pPr>
         <w:pStyle w:val="ListBullet"/>
+        <w:spacing w:line="312" w:lineRule="auto" w:after="0" w:before="0"/>
       </w:pPr>
       <w:r>
         <w:t>[ ] Filtering and pagination work correctly</w:t>
@@ -4079,6 +4600,9 @@
     </w:p>
     <w:p/>
     <w:p>
+      <w:pPr>
+        <w:spacing w:line="312" w:lineRule="auto" w:after="120"/>
+      </w:pPr>
       <w:r>
         <w:rPr>
           <w:b/>
@@ -4089,6 +4613,7 @@
     <w:p>
       <w:pPr>
         <w:pStyle w:val="ListBullet"/>
+        <w:spacing w:line="312" w:lineRule="auto" w:after="0" w:before="0"/>
       </w:pPr>
       <w:r>
         <w:t>[ ] Rate limit errors (429) are handled gracefully</w:t>
@@ -4097,6 +4622,7 @@
     <w:p>
       <w:pPr>
         <w:pStyle w:val="ListBullet"/>
+        <w:spacing w:line="312" w:lineRule="auto" w:after="0" w:before="0"/>
       </w:pPr>
       <w:r>
         <w:t>[ ] Network timeout errors are handled</w:t>
@@ -4105,6 +4631,7 @@
     <w:p>
       <w:pPr>
         <w:pStyle w:val="ListBullet"/>
+        <w:spacing w:line="312" w:lineRule="auto" w:after="0" w:before="0"/>
       </w:pPr>
       <w:r>
         <w:t>[ ] Invalid token errors trigger refresh</w:t>
@@ -4113,6 +4640,7 @@
     <w:p>
       <w:pPr>
         <w:pStyle w:val="ListBullet"/>
+        <w:spacing w:line="312" w:lineRule="auto" w:after="0" w:before="0"/>
       </w:pPr>
       <w:r>
         <w:t>[ ] Malformed responses are logged and handled</w:t>
@@ -4120,12 +4648,18 @@
     </w:p>
     <w:p/>
     <w:p>
+      <w:pPr>
+        <w:spacing w:line="312" w:lineRule="auto" w:after="120"/>
+      </w:pPr>
       <w:r>
         <w:t>### 8.2 Integration Testing Scenarios</w:t>
       </w:r>
     </w:p>
     <w:p/>
     <w:p>
+      <w:pPr>
+        <w:spacing w:line="312" w:lineRule="auto" w:after="120"/>
+      </w:pPr>
       <w:r>
         <w:rPr>
           <w:b/>
@@ -4136,6 +4670,7 @@
     <w:p>
       <w:pPr>
         <w:pStyle w:val="ListNumber"/>
+        <w:spacing w:line="312" w:lineRule="auto" w:after="0" w:before="0"/>
       </w:pPr>
       <w:r>
         <w:t>User clicks "Login with ClassLink"</w:t>
@@ -4144,6 +4679,7 @@
     <w:p>
       <w:pPr>
         <w:pStyle w:val="ListNumber"/>
+        <w:spacing w:line="312" w:lineRule="auto" w:after="0" w:before="0"/>
       </w:pPr>
       <w:r>
         <w:t>Redirected to ClassLink login page</w:t>
@@ -4152,6 +4688,7 @@
     <w:p>
       <w:pPr>
         <w:pStyle w:val="ListNumber"/>
+        <w:spacing w:line="312" w:lineRule="auto" w:after="0" w:before="0"/>
       </w:pPr>
       <w:r>
         <w:t>User authenticates successfully</w:t>
@@ -4160,6 +4697,7 @@
     <w:p>
       <w:pPr>
         <w:pStyle w:val="ListNumber"/>
+        <w:spacing w:line="312" w:lineRule="auto" w:after="0" w:before="0"/>
       </w:pPr>
       <w:r>
         <w:t>Redirected back to MyGPS with authorization code</w:t>
@@ -4168,6 +4706,7 @@
     <w:p>
       <w:pPr>
         <w:pStyle w:val="ListNumber"/>
+        <w:spacing w:line="312" w:lineRule="auto" w:after="0" w:before="0"/>
       </w:pPr>
       <w:r>
         <w:t>MyGPS exchanges code for tokens</w:t>
@@ -4176,6 +4715,7 @@
     <w:p>
       <w:pPr>
         <w:pStyle w:val="ListNumber"/>
+        <w:spacing w:line="312" w:lineRule="auto" w:after="0" w:before="0"/>
       </w:pPr>
       <w:r>
         <w:t>MyGPS retrieves user info and creates/updates user record</w:t>
@@ -4184,6 +4724,7 @@
     <w:p>
       <w:pPr>
         <w:pStyle w:val="ListNumber"/>
+        <w:spacing w:line="312" w:lineRule="auto" w:after="0" w:before="0"/>
       </w:pPr>
       <w:r>
         <w:t>User is logged into MyGPS</w:t>
@@ -4191,6 +4732,9 @@
     </w:p>
     <w:p/>
     <w:p>
+      <w:pPr>
+        <w:spacing w:line="312" w:lineRule="auto" w:after="120"/>
+      </w:pPr>
       <w:r>
         <w:rPr>
           <w:b/>
@@ -4201,6 +4745,7 @@
     <w:p>
       <w:pPr>
         <w:pStyle w:val="ListNumber"/>
+        <w:spacing w:line="312" w:lineRule="auto" w:after="0" w:before="0"/>
       </w:pPr>
       <w:r>
         <w:t>Scheduled sync job triggers</w:t>
@@ -4209,6 +4754,7 @@
     <w:p>
       <w:pPr>
         <w:pStyle w:val="ListNumber"/>
+        <w:spacing w:line="312" w:lineRule="auto" w:after="0" w:before="0"/>
       </w:pPr>
       <w:r>
         <w:t>Authenticates with ClassLink</w:t>
@@ -4217,6 +4763,7 @@
     <w:p>
       <w:pPr>
         <w:pStyle w:val="ListNumber"/>
+        <w:spacing w:line="312" w:lineRule="auto" w:after="0" w:before="0"/>
       </w:pPr>
       <w:r>
         <w:t>Fetches modified users since last sync</w:t>
@@ -4225,6 +4772,7 @@
     <w:p>
       <w:pPr>
         <w:pStyle w:val="ListNumber"/>
+        <w:spacing w:line="312" w:lineRule="auto" w:after="0" w:before="0"/>
       </w:pPr>
       <w:r>
         <w:t>Validates and transforms data</w:t>
@@ -4233,6 +4781,7 @@
     <w:p>
       <w:pPr>
         <w:pStyle w:val="ListNumber"/>
+        <w:spacing w:line="312" w:lineRule="auto" w:after="0" w:before="0"/>
       </w:pPr>
       <w:r>
         <w:t>Updates MyGPS user records</w:t>
@@ -4241,6 +4790,7 @@
     <w:p>
       <w:pPr>
         <w:pStyle w:val="ListNumber"/>
+        <w:spacing w:line="312" w:lineRule="auto" w:after="0" w:before="0"/>
       </w:pPr>
       <w:r>
         <w:t>Logs sync results</w:t>
@@ -4248,6 +4798,9 @@
     </w:p>
     <w:p/>
     <w:p>
+      <w:pPr>
+        <w:spacing w:line="312" w:lineRule="auto" w:after="120"/>
+      </w:pPr>
       <w:r>
         <w:rPr>
           <w:b/>
@@ -4258,6 +4811,7 @@
     <w:p>
       <w:pPr>
         <w:pStyle w:val="ListNumber"/>
+        <w:spacing w:line="312" w:lineRule="auto" w:after="0" w:before="0"/>
       </w:pPr>
       <w:r>
         <w:t>User is logged in via ClassLink</w:t>
@@ -4266,6 +4820,7 @@
     <w:p>
       <w:pPr>
         <w:pStyle w:val="ListNumber"/>
+        <w:spacing w:line="312" w:lineRule="auto" w:after="0" w:before="0"/>
       </w:pPr>
       <w:r>
         <w:t>Access token expires during session</w:t>
@@ -4274,6 +4829,7 @@
     <w:p>
       <w:pPr>
         <w:pStyle w:val="ListNumber"/>
+        <w:spacing w:line="312" w:lineRule="auto" w:after="0" w:before="0"/>
       </w:pPr>
       <w:r>
         <w:t>MyGPS detects expired token</w:t>
@@ -4282,6 +4838,7 @@
     <w:p>
       <w:pPr>
         <w:pStyle w:val="ListNumber"/>
+        <w:spacing w:line="312" w:lineRule="auto" w:after="0" w:before="0"/>
       </w:pPr>
       <w:r>
         <w:t>Automatically refreshes token using refresh token</w:t>
@@ -4290,6 +4847,7 @@
     <w:p>
       <w:pPr>
         <w:pStyle w:val="ListNumber"/>
+        <w:spacing w:line="312" w:lineRule="auto" w:after="0" w:before="0"/>
       </w:pPr>
       <w:r>
         <w:t>Retries original request</w:t>
@@ -4298,6 +4856,7 @@
     <w:p>
       <w:pPr>
         <w:pStyle w:val="ListNumber"/>
+        <w:spacing w:line="312" w:lineRule="auto" w:after="0" w:before="0"/>
       </w:pPr>
       <w:r>
         <w:t>User experience is uninterrupted</w:t>
@@ -4305,12 +4864,18 @@
     </w:p>
     <w:p/>
     <w:p>
+      <w:pPr>
+        <w:spacing w:line="312" w:lineRule="auto" w:after="120"/>
+      </w:pPr>
       <w:r>
         <w:t>### 8.3 Performance Testing</w:t>
       </w:r>
     </w:p>
     <w:p/>
     <w:p>
+      <w:pPr>
+        <w:spacing w:line="312" w:lineRule="auto" w:after="120"/>
+      </w:pPr>
       <w:r>
         <w:rPr>
           <w:b/>
@@ -4321,6 +4886,7 @@
     <w:p>
       <w:pPr>
         <w:pStyle w:val="ListBullet"/>
+        <w:spacing w:line="312" w:lineRule="auto" w:after="0" w:before="0"/>
       </w:pPr>
       <w:r>
         <w:rPr>
@@ -4335,6 +4901,7 @@
     <w:p>
       <w:pPr>
         <w:pStyle w:val="ListBullet"/>
+        <w:spacing w:line="312" w:lineRule="auto" w:after="0" w:before="0"/>
       </w:pPr>
       <w:r>
         <w:rPr>
@@ -4349,6 +4916,7 @@
     <w:p>
       <w:pPr>
         <w:pStyle w:val="ListBullet"/>
+        <w:spacing w:line="312" w:lineRule="auto" w:after="0" w:before="0"/>
       </w:pPr>
       <w:r>
         <w:rPr>
@@ -4363,6 +4931,7 @@
     <w:p>
       <w:pPr>
         <w:pStyle w:val="ListBullet"/>
+        <w:spacing w:line="312" w:lineRule="auto" w:after="0" w:before="0"/>
       </w:pPr>
       <w:r>
         <w:rPr>
@@ -4376,6 +4945,9 @@
     </w:p>
     <w:p/>
     <w:p>
+      <w:pPr>
+        <w:spacing w:line="312" w:lineRule="auto" w:after="120"/>
+      </w:pPr>
       <w:r>
         <w:rPr>
           <w:b/>
@@ -4386,6 +4958,7 @@
     <w:p>
       <w:pPr>
         <w:pStyle w:val="ListBullet"/>
+        <w:spacing w:line="312" w:lineRule="auto" w:after="0" w:before="0"/>
       </w:pPr>
       <w:r>
         <w:t>Test behavior when ClassLink API is slow (&gt; 5 second responses)</w:t>
@@ -4394,6 +4967,7 @@
     <w:p>
       <w:pPr>
         <w:pStyle w:val="ListBullet"/>
+        <w:spacing w:line="312" w:lineRule="auto" w:after="0" w:before="0"/>
       </w:pPr>
       <w:r>
         <w:t>Test behavior when ClassLink API returns 503 errors</w:t>
@@ -4402,6 +4976,7 @@
     <w:p>
       <w:pPr>
         <w:pStyle w:val="ListBullet"/>
+        <w:spacing w:line="312" w:lineRule="auto" w:after="0" w:before="0"/>
       </w:pPr>
       <w:r>
         <w:t>Test behavior when rate limits are hit</w:t>
@@ -4410,18 +4985,27 @@
     <w:p/>
     <w:p/>
     <w:p>
+      <w:pPr>
+        <w:spacing w:line="312" w:lineRule="auto" w:after="120"/>
+      </w:pPr>
       <w:r>
         <w:t>## 9. Deployment &amp; Operations</w:t>
       </w:r>
     </w:p>
     <w:p/>
     <w:p>
+      <w:pPr>
+        <w:spacing w:line="312" w:lineRule="auto" w:after="120"/>
+      </w:pPr>
       <w:r>
         <w:t>### 9.1 Pre-Deployment Checklist</w:t>
       </w:r>
     </w:p>
     <w:p/>
     <w:p>
+      <w:pPr>
+        <w:spacing w:line="312" w:lineRule="auto" w:after="120"/>
+      </w:pPr>
       <w:r>
         <w:rPr>
           <w:b/>
@@ -4432,6 +5016,7 @@
     <w:p>
       <w:pPr>
         <w:pStyle w:val="ListBullet"/>
+        <w:spacing w:line="312" w:lineRule="auto" w:after="0" w:before="0"/>
       </w:pPr>
       <w:r>
         <w:t>[ ] Partner Portal account created and verified</w:t>
@@ -4440,6 +5025,7 @@
     <w:p>
       <w:pPr>
         <w:pStyle w:val="ListBullet"/>
+        <w:spacing w:line="312" w:lineRule="auto" w:after="0" w:before="0"/>
       </w:pPr>
       <w:r>
         <w:t>[ ] Client ID and Client Secret obtained</w:t>
@@ -4448,6 +5034,7 @@
     <w:p>
       <w:pPr>
         <w:pStyle w:val="ListBullet"/>
+        <w:spacing w:line="312" w:lineRule="auto" w:after="0" w:before="0"/>
       </w:pPr>
       <w:r>
         <w:t>[ ] Redirect URI registered and verified</w:t>
@@ -4456,6 +5043,7 @@
     <w:p>
       <w:pPr>
         <w:pStyle w:val="ListBullet"/>
+        <w:spacing w:line="312" w:lineRule="auto" w:after="0" w:before="0"/>
       </w:pPr>
       <w:r>
         <w:t>[ ] Domain verification completed</w:t>
@@ -4464,6 +5052,7 @@
     <w:p>
       <w:pPr>
         <w:pStyle w:val="ListBullet"/>
+        <w:spacing w:line="312" w:lineRule="auto" w:after="0" w:before="0"/>
       </w:pPr>
       <w:r>
         <w:t>[ ] Required scopes approved</w:t>
@@ -4472,6 +5061,7 @@
     <w:p>
       <w:pPr>
         <w:pStyle w:val="ListBullet"/>
+        <w:spacing w:line="312" w:lineRule="auto" w:after="0" w:before="0"/>
       </w:pPr>
       <w:r>
         <w:t>[ ] Test/sandbox environment access granted</w:t>
@@ -4479,6 +5069,9 @@
     </w:p>
     <w:p/>
     <w:p>
+      <w:pPr>
+        <w:spacing w:line="312" w:lineRule="auto" w:after="120"/>
+      </w:pPr>
       <w:r>
         <w:rPr>
           <w:b/>
@@ -4489,6 +5082,7 @@
     <w:p>
       <w:pPr>
         <w:pStyle w:val="ListBullet"/>
+        <w:spacing w:line="312" w:lineRule="auto" w:after="0" w:before="0"/>
       </w:pPr>
       <w:r>
         <w:t>[ ] Database schema updated with ClassLink tables</w:t>
@@ -4497,6 +5091,7 @@
     <w:p>
       <w:pPr>
         <w:pStyle w:val="ListBullet"/>
+        <w:spacing w:line="312" w:lineRule="auto" w:after="0" w:before="0"/>
       </w:pPr>
       <w:r>
         <w:t>[ ] API client library integrated</w:t>
@@ -4505,6 +5100,7 @@
     <w:p>
       <w:pPr>
         <w:pStyle w:val="ListBullet"/>
+        <w:spacing w:line="312" w:lineRule="auto" w:after="0" w:before="0"/>
       </w:pPr>
       <w:r>
         <w:t>[ ] Token storage encryption configured</w:t>
@@ -4513,6 +5109,7 @@
     <w:p>
       <w:pPr>
         <w:pStyle w:val="ListBullet"/>
+        <w:spacing w:line="312" w:lineRule="auto" w:after="0" w:before="0"/>
       </w:pPr>
       <w:r>
         <w:t>[ ] SSL certificates valid and configured</w:t>
@@ -4521,6 +5118,7 @@
     <w:p>
       <w:pPr>
         <w:pStyle w:val="ListBullet"/>
+        <w:spacing w:line="312" w:lineRule="auto" w:after="0" w:before="0"/>
       </w:pPr>
       <w:r>
         <w:t>[ ] Monitoring and alerting configured</w:t>
@@ -4529,6 +5127,7 @@
     <w:p>
       <w:pPr>
         <w:pStyle w:val="ListBullet"/>
+        <w:spacing w:line="312" w:lineRule="auto" w:after="0" w:before="0"/>
       </w:pPr>
       <w:r>
         <w:t>[ ] Error logging and tracking configured</w:t>
@@ -4536,12 +5135,18 @@
     </w:p>
     <w:p/>
     <w:p>
+      <w:pPr>
+        <w:spacing w:line="312" w:lineRule="auto" w:after="120"/>
+      </w:pPr>
       <w:r>
         <w:t>### 9.2 Environment Configuration</w:t>
       </w:r>
     </w:p>
     <w:p/>
     <w:p>
+      <w:pPr>
+        <w:spacing w:line="312" w:lineRule="auto" w:after="120"/>
+      </w:pPr>
       <w:r>
         <w:rPr>
           <w:b/>
@@ -4550,6 +5155,11 @@
       </w:r>
     </w:p>
     <w:p>
+      <w:pPr>
+        <w:pStyle w:val="IntenseQuote"/>
+        <w:spacing w:before="120" w:after="120"/>
+        <w:ind w:left="360"/>
+      </w:pPr>
       <w:r>
         <w:rPr>
           <w:rFonts w:ascii="Courier New" w:hAnsi="Courier New"/>
@@ -4600,6 +5210,9 @@
     </w:p>
     <w:p/>
     <w:p>
+      <w:pPr>
+        <w:spacing w:line="312" w:lineRule="auto" w:after="120"/>
+      </w:pPr>
       <w:r>
         <w:rPr>
           <w:b/>
@@ -4610,6 +5223,7 @@
     <w:p>
       <w:pPr>
         <w:pStyle w:val="ListBullet"/>
+        <w:spacing w:line="312" w:lineRule="auto" w:after="0" w:before="0"/>
       </w:pPr>
       <w:r>
         <w:rPr>
@@ -4624,6 +5238,7 @@
     <w:p>
       <w:pPr>
         <w:pStyle w:val="ListBullet"/>
+        <w:spacing w:line="312" w:lineRule="auto" w:after="0" w:before="0"/>
       </w:pPr>
       <w:r>
         <w:rPr>
@@ -4638,6 +5253,7 @@
     <w:p>
       <w:pPr>
         <w:pStyle w:val="ListBullet"/>
+        <w:spacing w:line="312" w:lineRule="auto" w:after="0" w:before="0"/>
       </w:pPr>
       <w:r>
         <w:rPr>
@@ -4651,12 +5267,18 @@
     </w:p>
     <w:p/>
     <w:p>
+      <w:pPr>
+        <w:spacing w:line="312" w:lineRule="auto" w:after="120"/>
+      </w:pPr>
       <w:r>
         <w:t>### 9.3 Monitoring &amp; Observability</w:t>
       </w:r>
     </w:p>
     <w:p/>
     <w:p>
+      <w:pPr>
+        <w:spacing w:line="312" w:lineRule="auto" w:after="120"/>
+      </w:pPr>
       <w:r>
         <w:rPr>
           <w:b/>
@@ -4667,6 +5289,7 @@
     <w:p>
       <w:pPr>
         <w:pStyle w:val="ListBullet"/>
+        <w:spacing w:line="312" w:lineRule="auto" w:after="0" w:before="0"/>
       </w:pPr>
       <w:r>
         <w:t>Authentication success rate (target: &gt; 99%)</w:t>
@@ -4675,6 +5298,7 @@
     <w:p>
       <w:pPr>
         <w:pStyle w:val="ListBullet"/>
+        <w:spacing w:line="312" w:lineRule="auto" w:after="0" w:before="0"/>
       </w:pPr>
       <w:r>
         <w:t>Token refresh success rate (target: &gt; 99.5%)</w:t>
@@ -4683,6 +5307,7 @@
     <w:p>
       <w:pPr>
         <w:pStyle w:val="ListBullet"/>
+        <w:spacing w:line="312" w:lineRule="auto" w:after="0" w:before="0"/>
       </w:pPr>
       <w:r>
         <w:t>Roster sync success rate (target: &gt; 98%)</w:t>
@@ -4691,6 +5316,7 @@
     <w:p>
       <w:pPr>
         <w:pStyle w:val="ListBullet"/>
+        <w:spacing w:line="312" w:lineRule="auto" w:after="0" w:before="0"/>
       </w:pPr>
       <w:r>
         <w:t>API response time (target: P95 &lt; 2s)</w:t>
@@ -4699,6 +5325,7 @@
     <w:p>
       <w:pPr>
         <w:pStyle w:val="ListBullet"/>
+        <w:spacing w:line="312" w:lineRule="auto" w:after="0" w:before="0"/>
       </w:pPr>
       <w:r>
         <w:t>Error rate by error type</w:t>
@@ -4707,6 +5334,7 @@
     <w:p>
       <w:pPr>
         <w:pStyle w:val="ListBullet"/>
+        <w:spacing w:line="312" w:lineRule="auto" w:after="0" w:before="0"/>
       </w:pPr>
       <w:r>
         <w:t>Active ClassLink users count</w:t>
@@ -4714,6 +5342,9 @@
     </w:p>
     <w:p/>
     <w:p>
+      <w:pPr>
+        <w:spacing w:line="312" w:lineRule="auto" w:after="120"/>
+      </w:pPr>
       <w:r>
         <w:rPr>
           <w:b/>
@@ -4724,6 +5355,7 @@
     <w:p>
       <w:pPr>
         <w:pStyle w:val="ListBullet"/>
+        <w:spacing w:line="312" w:lineRule="auto" w:after="0" w:before="0"/>
       </w:pPr>
       <w:r>
         <w:t>Log all authentication attempts (without PII)</w:t>
@@ -4732,6 +5364,7 @@
     <w:p>
       <w:pPr>
         <w:pStyle w:val="ListBullet"/>
+        <w:spacing w:line="312" w:lineRule="auto" w:after="0" w:before="0"/>
       </w:pPr>
       <w:r>
         <w:t>Log all API requests/responses (sanitized)</w:t>
@@ -4740,6 +5373,7 @@
     <w:p>
       <w:pPr>
         <w:pStyle w:val="ListBullet"/>
+        <w:spacing w:line="312" w:lineRule="auto" w:after="0" w:before="0"/>
       </w:pPr>
       <w:r>
         <w:t>Log all sync operations with summary statistics</w:t>
@@ -4748,6 +5382,7 @@
     <w:p>
       <w:pPr>
         <w:pStyle w:val="ListBullet"/>
+        <w:spacing w:line="312" w:lineRule="auto" w:after="0" w:before="0"/>
       </w:pPr>
       <w:r>
         <w:t>Log all errors with full context</w:t>
@@ -4755,6 +5390,9 @@
     </w:p>
     <w:p/>
     <w:p>
+      <w:pPr>
+        <w:spacing w:line="312" w:lineRule="auto" w:after="120"/>
+      </w:pPr>
       <w:r>
         <w:rPr>
           <w:b/>
@@ -4765,6 +5403,7 @@
     <w:p>
       <w:pPr>
         <w:pStyle w:val="ListBullet"/>
+        <w:spacing w:line="312" w:lineRule="auto" w:after="0" w:before="0"/>
       </w:pPr>
       <w:r>
         <w:t>Alert if authentication failure rate &gt; 5% over 5 minutes</w:t>
@@ -4773,6 +5412,7 @@
     <w:p>
       <w:pPr>
         <w:pStyle w:val="ListBullet"/>
+        <w:spacing w:line="312" w:lineRule="auto" w:after="0" w:before="0"/>
       </w:pPr>
       <w:r>
         <w:t>Alert if sync job fails 3 consecutive times</w:t>
@@ -4781,6 +5421,7 @@
     <w:p>
       <w:pPr>
         <w:pStyle w:val="ListBullet"/>
+        <w:spacing w:line="312" w:lineRule="auto" w:after="0" w:before="0"/>
       </w:pPr>
       <w:r>
         <w:t>Alert if API response time P95 &gt; 5 seconds</w:t>
@@ -4789,6 +5430,7 @@
     <w:p>
       <w:pPr>
         <w:pStyle w:val="ListBullet"/>
+        <w:spacing w:line="312" w:lineRule="auto" w:after="0" w:before="0"/>
       </w:pPr>
       <w:r>
         <w:t>Alert if ClassLink API is unavailable for &gt; 5 minutes</w:t>
@@ -4797,12 +5439,18 @@
     <w:p/>
     <w:p/>
     <w:p>
+      <w:pPr>
+        <w:spacing w:line="312" w:lineRule="auto" w:after="120"/>
+      </w:pPr>
       <w:r>
         <w:t>## 10. Risk Assessment &amp; Mitigation</w:t>
       </w:r>
     </w:p>
     <w:p/>
     <w:p>
+      <w:pPr>
+        <w:spacing w:line="312" w:lineRule="auto" w:after="120"/>
+      </w:pPr>
       <w:r>
         <w:t>### 10.1 Technical Risks</w:t>
       </w:r>
@@ -5129,6 +5777,9 @@
     </w:tbl>
     <w:p/>
     <w:p>
+      <w:pPr>
+        <w:spacing w:line="312" w:lineRule="auto" w:after="120"/>
+      </w:pPr>
       <w:r>
         <w:t>### 10.2 Operational Risks</w:t>
       </w:r>
@@ -5372,18 +6023,27 @@
     <w:p/>
     <w:p/>
     <w:p>
+      <w:pPr>
+        <w:spacing w:line="312" w:lineRule="auto" w:after="120"/>
+      </w:pPr>
       <w:r>
         <w:t>## 11. Timeline &amp; Resource Requirements</w:t>
       </w:r>
     </w:p>
     <w:p/>
     <w:p>
+      <w:pPr>
+        <w:spacing w:line="312" w:lineRule="auto" w:after="120"/>
+      </w:pPr>
       <w:r>
         <w:t>### 11.1 Development Timeline</w:t>
       </w:r>
     </w:p>
     <w:p/>
     <w:p>
+      <w:pPr>
+        <w:spacing w:line="312" w:lineRule="auto" w:after="120"/>
+      </w:pPr>
       <w:r>
         <w:rPr>
           <w:b/>
@@ -5394,6 +6054,7 @@
     <w:p>
       <w:pPr>
         <w:pStyle w:val="ListBullet"/>
+        <w:spacing w:line="312" w:lineRule="auto" w:after="0" w:before="0"/>
       </w:pPr>
       <w:r>
         <w:t>Set up ClassLink Partner Portal account</w:t>
@@ -5402,6 +6063,7 @@
     <w:p>
       <w:pPr>
         <w:pStyle w:val="ListBullet"/>
+        <w:spacing w:line="312" w:lineRule="auto" w:after="0" w:before="0"/>
       </w:pPr>
       <w:r>
         <w:t>Complete domain verification</w:t>
@@ -5410,6 +6072,7 @@
     <w:p>
       <w:pPr>
         <w:pStyle w:val="ListBullet"/>
+        <w:spacing w:line="312" w:lineRule="auto" w:after="0" w:before="0"/>
       </w:pPr>
       <w:r>
         <w:t>Configure OAuth2 client credentials</w:t>
@@ -5418,6 +6081,7 @@
     <w:p>
       <w:pPr>
         <w:pStyle w:val="ListBullet"/>
+        <w:spacing w:line="312" w:lineRule="auto" w:after="0" w:before="0"/>
       </w:pPr>
       <w:r>
         <w:t>Implement basic authentication flow</w:t>
@@ -5426,6 +6090,7 @@
     <w:p>
       <w:pPr>
         <w:pStyle w:val="ListBullet"/>
+        <w:spacing w:line="312" w:lineRule="auto" w:after="0" w:before="0"/>
       </w:pPr>
       <w:r>
         <w:t>Set up database schema</w:t>
@@ -5433,6 +6098,9 @@
     </w:p>
     <w:p/>
     <w:p>
+      <w:pPr>
+        <w:spacing w:line="312" w:lineRule="auto" w:after="120"/>
+      </w:pPr>
       <w:r>
         <w:rPr>
           <w:b/>
@@ -5443,6 +6111,7 @@
     <w:p>
       <w:pPr>
         <w:pStyle w:val="ListBullet"/>
+        <w:spacing w:line="312" w:lineRule="auto" w:after="0" w:before="0"/>
       </w:pPr>
       <w:r>
         <w:t>Implement API client library</w:t>
@@ -5451,6 +6120,7 @@
     <w:p>
       <w:pPr>
         <w:pStyle w:val="ListBullet"/>
+        <w:spacing w:line="312" w:lineRule="auto" w:after="0" w:before="0"/>
       </w:pPr>
       <w:r>
         <w:t>Develop user data retrieval endpoints</w:t>
@@ -5459,6 +6129,7 @@
     <w:p>
       <w:pPr>
         <w:pStyle w:val="ListBullet"/>
+        <w:spacing w:line="312" w:lineRule="auto" w:after="0" w:before="0"/>
       </w:pPr>
       <w:r>
         <w:t>Build roster synchronization job</w:t>
@@ -5467,6 +6138,7 @@
     <w:p>
       <w:pPr>
         <w:pStyle w:val="ListBullet"/>
+        <w:spacing w:line="312" w:lineRule="auto" w:after="0" w:before="0"/>
       </w:pPr>
       <w:r>
         <w:t>Implement token management</w:t>
@@ -5475,6 +6147,7 @@
     <w:p>
       <w:pPr>
         <w:pStyle w:val="ListBullet"/>
+        <w:spacing w:line="312" w:lineRule="auto" w:after="0" w:before="0"/>
       </w:pPr>
       <w:r>
         <w:t>Create admin dashboard UI</w:t>
@@ -5482,6 +6155,9 @@
     </w:p>
     <w:p/>
     <w:p>
+      <w:pPr>
+        <w:spacing w:line="312" w:lineRule="auto" w:after="120"/>
+      </w:pPr>
       <w:r>
         <w:rPr>
           <w:b/>
@@ -5492,6 +6168,7 @@
     <w:p>
       <w:pPr>
         <w:pStyle w:val="ListBullet"/>
+        <w:spacing w:line="312" w:lineRule="auto" w:after="0" w:before="0"/>
       </w:pPr>
       <w:r>
         <w:t>Implement security measures (encryption, validation)</w:t>
@@ -5500,6 +6177,7 @@
     <w:p>
       <w:pPr>
         <w:pStyle w:val="ListBullet"/>
+        <w:spacing w:line="312" w:lineRule="auto" w:after="0" w:before="0"/>
       </w:pPr>
       <w:r>
         <w:t>Write unit and integration tests</w:t>
@@ -5508,6 +6186,7 @@
     <w:p>
       <w:pPr>
         <w:pStyle w:val="ListBullet"/>
+        <w:spacing w:line="312" w:lineRule="auto" w:after="0" w:before="0"/>
       </w:pPr>
       <w:r>
         <w:t>Perform security audit</w:t>
@@ -5516,6 +6195,7 @@
     <w:p>
       <w:pPr>
         <w:pStyle w:val="ListBullet"/>
+        <w:spacing w:line="312" w:lineRule="auto" w:after="0" w:before="0"/>
       </w:pPr>
       <w:r>
         <w:t>Load testing and performance tuning</w:t>
@@ -5524,6 +6204,7 @@
     <w:p>
       <w:pPr>
         <w:pStyle w:val="ListBullet"/>
+        <w:spacing w:line="312" w:lineRule="auto" w:after="0" w:before="0"/>
       </w:pPr>
       <w:r>
         <w:t>Documentation and runbooks</w:t>
@@ -5531,6 +6212,9 @@
     </w:p>
     <w:p/>
     <w:p>
+      <w:pPr>
+        <w:spacing w:line="312" w:lineRule="auto" w:after="120"/>
+      </w:pPr>
       <w:r>
         <w:rPr>
           <w:b/>
@@ -5541,6 +6225,7 @@
     <w:p>
       <w:pPr>
         <w:pStyle w:val="ListBullet"/>
+        <w:spacing w:line="312" w:lineRule="auto" w:after="0" w:before="0"/>
       </w:pPr>
       <w:r>
         <w:t>Submit for ClassLink certification</w:t>
@@ -5549,6 +6234,7 @@
     <w:p>
       <w:pPr>
         <w:pStyle w:val="ListBullet"/>
+        <w:spacing w:line="312" w:lineRule="auto" w:after="0" w:before="0"/>
       </w:pPr>
       <w:r>
         <w:t>Address certification feedback</w:t>
@@ -5557,6 +6243,7 @@
     <w:p>
       <w:pPr>
         <w:pStyle w:val="ListBullet"/>
+        <w:spacing w:line="312" w:lineRule="auto" w:after="0" w:before="0"/>
       </w:pPr>
       <w:r>
         <w:t>Production deployment</w:t>
@@ -5565,6 +6252,7 @@
     <w:p>
       <w:pPr>
         <w:pStyle w:val="ListBullet"/>
+        <w:spacing w:line="312" w:lineRule="auto" w:after="0" w:before="0"/>
       </w:pPr>
       <w:r>
         <w:t>Monitor and support initial users</w:t>
@@ -5572,12 +6260,18 @@
     </w:p>
     <w:p/>
     <w:p>
+      <w:pPr>
+        <w:spacing w:line="312" w:lineRule="auto" w:after="120"/>
+      </w:pPr>
       <w:r>
         <w:t>### 11.2 Resource Requirements</w:t>
       </w:r>
     </w:p>
     <w:p/>
     <w:p>
+      <w:pPr>
+        <w:spacing w:line="312" w:lineRule="auto" w:after="120"/>
+      </w:pPr>
       <w:r>
         <w:rPr>
           <w:b/>
@@ -5588,6 +6282,7 @@
     <w:p>
       <w:pPr>
         <w:pStyle w:val="ListBullet"/>
+        <w:spacing w:line="312" w:lineRule="auto" w:after="0" w:before="0"/>
       </w:pPr>
       <w:r>
         <w:t>1 Backend Developer (full-time, 7 weeks)</w:t>
@@ -5596,6 +6291,7 @@
     <w:p>
       <w:pPr>
         <w:pStyle w:val="ListBullet"/>
+        <w:spacing w:line="312" w:lineRule="auto" w:after="0" w:before="0"/>
       </w:pPr>
       <w:r>
         <w:t>1 Frontend Developer (part-time, weeks 3-4, 7)</w:t>
@@ -5604,6 +6300,7 @@
     <w:p>
       <w:pPr>
         <w:pStyle w:val="ListBullet"/>
+        <w:spacing w:line="312" w:lineRule="auto" w:after="0" w:before="0"/>
       </w:pPr>
       <w:r>
         <w:t>1 QA Engineer (part-time, weeks 5-6)</w:t>
@@ -5612,6 +6309,7 @@
     <w:p>
       <w:pPr>
         <w:pStyle w:val="ListBullet"/>
+        <w:spacing w:line="312" w:lineRule="auto" w:after="0" w:before="0"/>
       </w:pPr>
       <w:r>
         <w:t>1 DevOps Engineer (part-time, weeks 1, 6-7)</w:t>
@@ -5619,6 +6317,9 @@
     </w:p>
     <w:p/>
     <w:p>
+      <w:pPr>
+        <w:spacing w:line="312" w:lineRule="auto" w:after="120"/>
+      </w:pPr>
       <w:r>
         <w:rPr>
           <w:b/>
@@ -5629,6 +6330,7 @@
     <w:p>
       <w:pPr>
         <w:pStyle w:val="ListBullet"/>
+        <w:spacing w:line="312" w:lineRule="auto" w:after="0" w:before="0"/>
       </w:pPr>
       <w:r>
         <w:t>Database capacity for additional tables and indexes</w:t>
@@ -5637,6 +6339,7 @@
     <w:p>
       <w:pPr>
         <w:pStyle w:val="ListBullet"/>
+        <w:spacing w:line="312" w:lineRule="auto" w:after="0" w:before="0"/>
       </w:pPr>
       <w:r>
         <w:t>SSL certificates (Let's Encrypt or commercial)</w:t>
@@ -5645,6 +6348,7 @@
     <w:p>
       <w:pPr>
         <w:pStyle w:val="ListBullet"/>
+        <w:spacing w:line="312" w:lineRule="auto" w:after="0" w:before="0"/>
       </w:pPr>
       <w:r>
         <w:t>Monitoring and alerting tools (existing or new)</w:t>
@@ -5653,6 +6357,7 @@
     <w:p>
       <w:pPr>
         <w:pStyle w:val="ListBullet"/>
+        <w:spacing w:line="312" w:lineRule="auto" w:after="0" w:before="0"/>
       </w:pPr>
       <w:r>
         <w:t>Encryption key management service</w:t>
@@ -5660,6 +6365,9 @@
     </w:p>
     <w:p/>
     <w:p>
+      <w:pPr>
+        <w:spacing w:line="312" w:lineRule="auto" w:after="120"/>
+      </w:pPr>
       <w:r>
         <w:rPr>
           <w:b/>
@@ -5670,6 +6378,7 @@
     <w:p>
       <w:pPr>
         <w:pStyle w:val="ListBullet"/>
+        <w:spacing w:line="312" w:lineRule="auto" w:after="0" w:before="0"/>
       </w:pPr>
       <w:r>
         <w:t>ClassLink Partner Portal access</w:t>
@@ -5678,6 +6387,7 @@
     <w:p>
       <w:pPr>
         <w:pStyle w:val="ListBullet"/>
+        <w:spacing w:line="312" w:lineRule="auto" w:after="0" w:before="0"/>
       </w:pPr>
       <w:r>
         <w:t>ClassLink Partner Relationship Manager coordination</w:t>
@@ -5686,6 +6396,7 @@
     <w:p>
       <w:pPr>
         <w:pStyle w:val="ListBullet"/>
+        <w:spacing w:line="312" w:lineRule="auto" w:after="0" w:before="0"/>
       </w:pPr>
       <w:r>
         <w:t>Test accounts from ClassLink</w:t>
@@ -5694,18 +6405,27 @@
     <w:p/>
     <w:p/>
     <w:p>
+      <w:pPr>
+        <w:spacing w:line="312" w:lineRule="auto" w:after="120"/>
+      </w:pPr>
       <w:r>
         <w:t>## 12. Conclusion &amp; Recommendations</w:t>
       </w:r>
     </w:p>
     <w:p/>
     <w:p>
+      <w:pPr>
+        <w:spacing w:line="312" w:lineRule="auto" w:after="120"/>
+      </w:pPr>
       <w:r>
         <w:t>### 12.1 Feasibility Assessment</w:t>
       </w:r>
     </w:p>
     <w:p/>
     <w:p>
+      <w:pPr>
+        <w:spacing w:line="312" w:lineRule="auto" w:after="120"/>
+      </w:pPr>
       <w:r>
         <w:rPr>
           <w:b/>
@@ -5715,12 +6435,18 @@
     </w:p>
     <w:p/>
     <w:p>
+      <w:pPr>
+        <w:spacing w:line="312" w:lineRule="auto" w:after="120"/>
+      </w:pPr>
       <w:r>
         <w:t>The integration with ClassLink Partner Portal API is technically feasible and aligns with MyGPS's architecture. The OAuth2/OpenID Connect authentication flow is well-documented and standard. The API endpoints provide sufficient access to user data, rosters, and organizational information.</w:t>
       </w:r>
     </w:p>
     <w:p/>
     <w:p>
+      <w:pPr>
+        <w:spacing w:line="312" w:lineRule="auto" w:after="120"/>
+      </w:pPr>
       <w:r>
         <w:rPr>
           <w:b/>
@@ -5731,6 +6457,7 @@
     <w:p>
       <w:pPr>
         <w:pStyle w:val="ListBullet"/>
+        <w:spacing w:line="312" w:lineRule="auto" w:after="0" w:before="0"/>
       </w:pPr>
       <w:r>
         <w:t>Standard OAuth2 implementation (well-understood)</w:t>
@@ -5739,6 +6466,7 @@
     <w:p>
       <w:pPr>
         <w:pStyle w:val="ListBullet"/>
+        <w:spacing w:line="312" w:lineRule="auto" w:after="0" w:before="0"/>
       </w:pPr>
       <w:r>
         <w:t>Comprehensive API endpoints for user data</w:t>
@@ -5747,6 +6475,7 @@
     <w:p>
       <w:pPr>
         <w:pStyle w:val="ListBullet"/>
+        <w:spacing w:line="312" w:lineRule="auto" w:after="0" w:before="0"/>
       </w:pPr>
       <w:r>
         <w:t>Good documentation and partner support</w:t>
@@ -5755,6 +6484,7 @@
     <w:p>
       <w:pPr>
         <w:pStyle w:val="ListBullet"/>
+        <w:spacing w:line="312" w:lineRule="auto" w:after="0" w:before="0"/>
       </w:pPr>
       <w:r>
         <w:t>Secure token-based authentication</w:t>
@@ -5762,6 +6492,9 @@
     </w:p>
     <w:p/>
     <w:p>
+      <w:pPr>
+        <w:spacing w:line="312" w:lineRule="auto" w:after="120"/>
+      </w:pPr>
       <w:r>
         <w:rPr>
           <w:b/>
@@ -5772,6 +6505,7 @@
     <w:p>
       <w:pPr>
         <w:pStyle w:val="ListBullet"/>
+        <w:spacing w:line="312" w:lineRule="auto" w:after="0" w:before="0"/>
       </w:pPr>
       <w:r>
         <w:t>No custom login page support (requires standardized redirect)</w:t>
@@ -5780,6 +6514,7 @@
     <w:p>
       <w:pPr>
         <w:pStyle w:val="ListBullet"/>
+        <w:spacing w:line="312" w:lineRule="auto" w:after="0" w:before="0"/>
       </w:pPr>
       <w:r>
         <w:t>Token management complexity (refresh, expiry, storage)</w:t>
@@ -5788,6 +6523,7 @@
     <w:p>
       <w:pPr>
         <w:pStyle w:val="ListBullet"/>
+        <w:spacing w:line="312" w:lineRule="auto" w:after="0" w:before="0"/>
       </w:pPr>
       <w:r>
         <w:t>Rate limiting requires careful request management</w:t>
@@ -5796,6 +6532,7 @@
     <w:p>
       <w:pPr>
         <w:pStyle w:val="ListBullet"/>
+        <w:spacing w:line="312" w:lineRule="auto" w:after="0" w:before="0"/>
       </w:pPr>
       <w:r>
         <w:t>Dependency on external API availability</w:t>
@@ -5803,6 +6540,9 @@
     </w:p>
     <w:p/>
     <w:p>
+      <w:pPr>
+        <w:spacing w:line="312" w:lineRule="auto" w:after="120"/>
+      </w:pPr>
       <w:r>
         <w:t>### 12.2 Recommendations</w:t>
       </w:r>
@@ -5811,6 +6551,7 @@
     <w:p>
       <w:pPr>
         <w:pStyle w:val="ListNumber"/>
+        <w:spacing w:line="312" w:lineRule="auto" w:after="0" w:before="0"/>
       </w:pPr>
       <w:r>
         <w:rPr>
@@ -5822,6 +6563,7 @@
     <w:p>
       <w:pPr>
         <w:pStyle w:val="ListBullet"/>
+        <w:spacing w:line="312" w:lineRule="auto" w:after="0" w:before="0"/>
         <w:ind w:left="240"/>
       </w:pPr>
       <w:r>
@@ -5831,6 +6573,7 @@
     <w:p>
       <w:pPr>
         <w:pStyle w:val="ListBullet"/>
+        <w:spacing w:line="312" w:lineRule="auto" w:after="0" w:before="0"/>
         <w:ind w:left="240"/>
       </w:pPr>
       <w:r>
@@ -5840,6 +6583,7 @@
     <w:p>
       <w:pPr>
         <w:pStyle w:val="ListBullet"/>
+        <w:spacing w:line="312" w:lineRule="auto" w:after="0" w:before="0"/>
         <w:ind w:left="240"/>
       </w:pPr>
       <w:r>
@@ -5850,6 +6594,7 @@
     <w:p>
       <w:pPr>
         <w:pStyle w:val="ListNumber"/>
+        <w:spacing w:line="312" w:lineRule="auto" w:after="0" w:before="0"/>
       </w:pPr>
       <w:r>
         <w:rPr>
@@ -5861,6 +6606,7 @@
     <w:p>
       <w:pPr>
         <w:pStyle w:val="ListBullet"/>
+        <w:spacing w:line="312" w:lineRule="auto" w:after="0" w:before="0"/>
         <w:ind w:left="240"/>
       </w:pPr>
       <w:r>
@@ -5870,6 +6616,7 @@
     <w:p>
       <w:pPr>
         <w:pStyle w:val="ListBullet"/>
+        <w:spacing w:line="312" w:lineRule="auto" w:after="0" w:before="0"/>
         <w:ind w:left="240"/>
       </w:pPr>
       <w:r>
@@ -5879,6 +6626,7 @@
     <w:p>
       <w:pPr>
         <w:pStyle w:val="ListBullet"/>
+        <w:spacing w:line="312" w:lineRule="auto" w:after="0" w:before="0"/>
         <w:ind w:left="240"/>
       </w:pPr>
       <w:r>
@@ -5889,6 +6637,7 @@
     <w:p>
       <w:pPr>
         <w:pStyle w:val="ListNumber"/>
+        <w:spacing w:line="312" w:lineRule="auto" w:after="0" w:before="0"/>
       </w:pPr>
       <w:r>
         <w:rPr>
@@ -5900,6 +6649,7 @@
     <w:p>
       <w:pPr>
         <w:pStyle w:val="ListBullet"/>
+        <w:spacing w:line="312" w:lineRule="auto" w:after="0" w:before="0"/>
         <w:ind w:left="240"/>
       </w:pPr>
       <w:r>
@@ -5909,6 +6659,7 @@
     <w:p>
       <w:pPr>
         <w:pStyle w:val="ListBullet"/>
+        <w:spacing w:line="312" w:lineRule="auto" w:after="0" w:before="0"/>
         <w:ind w:left="240"/>
       </w:pPr>
       <w:r>
@@ -5918,6 +6669,7 @@
     <w:p>
       <w:pPr>
         <w:pStyle w:val="ListBullet"/>
+        <w:spacing w:line="312" w:lineRule="auto" w:after="0" w:before="0"/>
         <w:ind w:left="240"/>
       </w:pPr>
       <w:r>
@@ -5928,6 +6680,7 @@
     <w:p>
       <w:pPr>
         <w:pStyle w:val="ListNumber"/>
+        <w:spacing w:line="312" w:lineRule="auto" w:after="0" w:before="0"/>
       </w:pPr>
       <w:r>
         <w:rPr>
@@ -5939,6 +6692,7 @@
     <w:p>
       <w:pPr>
         <w:pStyle w:val="ListBullet"/>
+        <w:spacing w:line="312" w:lineRule="auto" w:after="0" w:before="0"/>
         <w:ind w:left="240"/>
       </w:pPr>
       <w:r>
@@ -5948,6 +6702,7 @@
     <w:p>
       <w:pPr>
         <w:pStyle w:val="ListBullet"/>
+        <w:spacing w:line="312" w:lineRule="auto" w:after="0" w:before="0"/>
         <w:ind w:left="240"/>
       </w:pPr>
       <w:r>
@@ -5957,6 +6712,7 @@
     <w:p>
       <w:pPr>
         <w:pStyle w:val="ListBullet"/>
+        <w:spacing w:line="312" w:lineRule="auto" w:after="0" w:before="0"/>
         <w:ind w:left="240"/>
       </w:pPr>
       <w:r>
@@ -5966,6 +6722,7 @@
     <w:p>
       <w:pPr>
         <w:pStyle w:val="ListBullet"/>
+        <w:spacing w:line="312" w:lineRule="auto" w:after="0" w:before="0"/>
         <w:ind w:left="240"/>
       </w:pPr>
       <w:r>
@@ -5976,6 +6733,7 @@
     <w:p>
       <w:pPr>
         <w:pStyle w:val="ListNumber"/>
+        <w:spacing w:line="312" w:lineRule="auto" w:after="0" w:before="0"/>
       </w:pPr>
       <w:r>
         <w:rPr>
@@ -5987,6 +6745,7 @@
     <w:p>
       <w:pPr>
         <w:pStyle w:val="ListBullet"/>
+        <w:spacing w:line="312" w:lineRule="auto" w:after="0" w:before="0"/>
         <w:ind w:left="240"/>
       </w:pPr>
       <w:r>
@@ -5996,6 +6755,7 @@
     <w:p>
       <w:pPr>
         <w:pStyle w:val="ListBullet"/>
+        <w:spacing w:line="312" w:lineRule="auto" w:after="0" w:before="0"/>
         <w:ind w:left="240"/>
       </w:pPr>
       <w:r>
@@ -6005,6 +6765,7 @@
     <w:p>
       <w:pPr>
         <w:pStyle w:val="ListBullet"/>
+        <w:spacing w:line="312" w:lineRule="auto" w:after="0" w:before="0"/>
         <w:ind w:left="240"/>
       </w:pPr>
       <w:r>
@@ -6014,6 +6775,7 @@
     <w:p>
       <w:pPr>
         <w:pStyle w:val="ListBullet"/>
+        <w:spacing w:line="312" w:lineRule="auto" w:after="0" w:before="0"/>
         <w:ind w:left="240"/>
       </w:pPr>
       <w:r>
@@ -6022,12 +6784,18 @@
     </w:p>
     <w:p/>
     <w:p>
+      <w:pPr>
+        <w:spacing w:line="312" w:lineRule="auto" w:after="120"/>
+      </w:pPr>
       <w:r>
         <w:t>### 12.3 Success Criteria</w:t>
       </w:r>
     </w:p>
     <w:p/>
     <w:p>
+      <w:pPr>
+        <w:spacing w:line="312" w:lineRule="auto" w:after="120"/>
+      </w:pPr>
       <w:r>
         <w:rPr>
           <w:b/>
@@ -6038,6 +6806,7 @@
     <w:p>
       <w:pPr>
         <w:pStyle w:val="ListBullet"/>
+        <w:spacing w:line="312" w:lineRule="auto" w:after="0" w:before="0"/>
       </w:pPr>
       <w:r>
         <w:t>✅ Authentication success rate &gt; 99%</w:t>
@@ -6046,6 +6815,7 @@
     <w:p>
       <w:pPr>
         <w:pStyle w:val="ListBullet"/>
+        <w:spacing w:line="312" w:lineRule="auto" w:after="0" w:before="0"/>
       </w:pPr>
       <w:r>
         <w:t>✅ Roster sync accuracy &gt; 98%</w:t>
@@ -6054,6 +6824,7 @@
     <w:p>
       <w:pPr>
         <w:pStyle w:val="ListBullet"/>
+        <w:spacing w:line="312" w:lineRule="auto" w:after="0" w:before="0"/>
       </w:pPr>
       <w:r>
         <w:t>✅ API response time P95 &lt; 2 seconds</w:t>
@@ -6062,6 +6833,7 @@
     <w:p>
       <w:pPr>
         <w:pStyle w:val="ListBullet"/>
+        <w:spacing w:line="312" w:lineRule="auto" w:after="0" w:before="0"/>
       </w:pPr>
       <w:r>
         <w:t>✅ Zero security incidents</w:t>
@@ -6069,6 +6841,9 @@
     </w:p>
     <w:p/>
     <w:p>
+      <w:pPr>
+        <w:spacing w:line="312" w:lineRule="auto" w:after="120"/>
+      </w:pPr>
       <w:r>
         <w:rPr>
           <w:b/>
@@ -6079,6 +6854,7 @@
     <w:p>
       <w:pPr>
         <w:pStyle w:val="ListBullet"/>
+        <w:spacing w:line="312" w:lineRule="auto" w:after="0" w:before="0"/>
       </w:pPr>
       <w:r>
         <w:t>✅ Successful ClassLink certification</w:t>
@@ -6087,6 +6863,7 @@
     <w:p>
       <w:pPr>
         <w:pStyle w:val="ListBullet"/>
+        <w:spacing w:line="312" w:lineRule="auto" w:after="0" w:before="0"/>
       </w:pPr>
       <w:r>
         <w:t>✅ Positive user feedback on SSO experience</w:t>
@@ -6095,6 +6872,7 @@
     <w:p>
       <w:pPr>
         <w:pStyle w:val="ListBullet"/>
+        <w:spacing w:line="312" w:lineRule="auto" w:after="0" w:before="0"/>
       </w:pPr>
       <w:r>
         <w:t>✅ Reduced support tickets for authentication issues</w:t>
@@ -6103,6 +6881,7 @@
     <w:p>
       <w:pPr>
         <w:pStyle w:val="ListBullet"/>
+        <w:spacing w:line="312" w:lineRule="auto" w:after="0" w:before="0"/>
       </w:pPr>
       <w:r>
         <w:t>✅ Increased adoption by ClassLink-using schools</w:t>
@@ -6111,12 +6890,18 @@
     <w:p/>
     <w:p/>
     <w:p>
+      <w:pPr>
+        <w:spacing w:line="312" w:lineRule="auto" w:after="120"/>
+      </w:pPr>
       <w:r>
         <w:t>## Appendix A: API Endpoint Reference</w:t>
       </w:r>
     </w:p>
     <w:p/>
     <w:p>
+      <w:pPr>
+        <w:spacing w:line="312" w:lineRule="auto" w:after="120"/>
+      </w:pPr>
       <w:r>
         <w:t>### A.1 Complete Endpoint List</w:t>
       </w:r>
@@ -6485,12 +7270,18 @@
     </w:tbl>
     <w:p/>
     <w:p>
+      <w:pPr>
+        <w:spacing w:line="312" w:lineRule="auto" w:after="120"/>
+      </w:pPr>
       <w:r>
         <w:t>### A.2 Request/Response Examples</w:t>
       </w:r>
     </w:p>
     <w:p/>
     <w:p>
+      <w:pPr>
+        <w:spacing w:line="312" w:lineRule="auto" w:after="120"/>
+      </w:pPr>
       <w:r>
         <w:rPr>
           <w:b/>
@@ -6499,6 +7290,11 @@
       </w:r>
     </w:p>
     <w:p>
+      <w:pPr>
+        <w:pStyle w:val="IntenseQuote"/>
+        <w:spacing w:before="120" w:after="120"/>
+        <w:ind w:left="360"/>
+      </w:pPr>
       <w:r>
         <w:rPr>
           <w:rFonts w:ascii="Courier New" w:hAnsi="Courier New"/>
@@ -6525,6 +7321,9 @@
     </w:p>
     <w:p/>
     <w:p>
+      <w:pPr>
+        <w:spacing w:line="312" w:lineRule="auto" w:after="120"/>
+      </w:pPr>
       <w:r>
         <w:rPr>
           <w:b/>
@@ -6533,6 +7332,11 @@
       </w:r>
     </w:p>
     <w:p>
+      <w:pPr>
+        <w:pStyle w:val="IntenseQuote"/>
+        <w:spacing w:before="120" w:after="120"/>
+        <w:ind w:left="360"/>
+      </w:pPr>
       <w:r>
         <w:rPr>
           <w:rFonts w:ascii="Courier New" w:hAnsi="Courier New"/>
@@ -6648,6 +7452,9 @@
     <w:p/>
     <w:p/>
     <w:p>
+      <w:pPr>
+        <w:spacing w:line="312" w:lineRule="auto" w:after="120"/>
+      </w:pPr>
       <w:r>
         <w:t>## Appendix B: Glossary</w:t>
       </w:r>
@@ -6656,6 +7463,7 @@
     <w:p>
       <w:pPr>
         <w:pStyle w:val="ListBullet"/>
+        <w:spacing w:line="312" w:lineRule="auto" w:after="0" w:before="0"/>
       </w:pPr>
       <w:r>
         <w:rPr>
@@ -6670,6 +7478,7 @@
     <w:p>
       <w:pPr>
         <w:pStyle w:val="ListBullet"/>
+        <w:spacing w:line="312" w:lineRule="auto" w:after="0" w:before="0"/>
       </w:pPr>
       <w:r>
         <w:rPr>
@@ -6684,6 +7493,7 @@
     <w:p>
       <w:pPr>
         <w:pStyle w:val="ListBullet"/>
+        <w:spacing w:line="312" w:lineRule="auto" w:after="0" w:before="0"/>
       </w:pPr>
       <w:r>
         <w:rPr>
@@ -6698,6 +7508,7 @@
     <w:p>
       <w:pPr>
         <w:pStyle w:val="ListBullet"/>
+        <w:spacing w:line="312" w:lineRule="auto" w:after="0" w:before="0"/>
       </w:pPr>
       <w:r>
         <w:rPr>
@@ -6712,6 +7523,7 @@
     <w:p>
       <w:pPr>
         <w:pStyle w:val="ListBullet"/>
+        <w:spacing w:line="312" w:lineRule="auto" w:after="0" w:before="0"/>
       </w:pPr>
       <w:r>
         <w:rPr>
@@ -6726,6 +7538,7 @@
     <w:p>
       <w:pPr>
         <w:pStyle w:val="ListBullet"/>
+        <w:spacing w:line="312" w:lineRule="auto" w:after="0" w:before="0"/>
       </w:pPr>
       <w:r>
         <w:rPr>
@@ -6740,6 +7553,7 @@
     <w:p>
       <w:pPr>
         <w:pStyle w:val="ListBullet"/>
+        <w:spacing w:line="312" w:lineRule="auto" w:after="0" w:before="0"/>
       </w:pPr>
       <w:r>
         <w:rPr>
@@ -6754,6 +7568,7 @@
     <w:p>
       <w:pPr>
         <w:pStyle w:val="ListBullet"/>
+        <w:spacing w:line="312" w:lineRule="auto" w:after="0" w:before="0"/>
       </w:pPr>
       <w:r>
         <w:rPr>
@@ -6768,12 +7583,18 @@
     <w:p/>
     <w:p/>
     <w:p>
+      <w:pPr>
+        <w:spacing w:line="312" w:lineRule="auto" w:after="120"/>
+      </w:pPr>
       <w:r>
         <w:t>## Document Control</w:t>
       </w:r>
     </w:p>
     <w:p/>
     <w:p>
+      <w:pPr>
+        <w:spacing w:line="312" w:lineRule="auto" w:after="120"/>
+      </w:pPr>
       <w:r>
         <w:rPr>
           <w:b/>
@@ -6784,6 +7605,7 @@
     <w:p>
       <w:pPr>
         <w:pStyle w:val="ListBullet"/>
+        <w:spacing w:line="312" w:lineRule="auto" w:after="0" w:before="0"/>
       </w:pPr>
       <w:r>
         <w:t>v1.0 (December 2024): Initial feasibility report</w:t>
@@ -6791,6 +7613,9 @@
     </w:p>
     <w:p/>
     <w:p>
+      <w:pPr>
+        <w:spacing w:line="312" w:lineRule="auto" w:after="120"/>
+      </w:pPr>
       <w:r>
         <w:rPr>
           <w:b/>
@@ -6801,6 +7626,7 @@
     <w:p>
       <w:pPr>
         <w:pStyle w:val="ListBullet"/>
+        <w:spacing w:line="312" w:lineRule="auto" w:after="0" w:before="0"/>
       </w:pPr>
       <w:r>
         <w:t>Review after ClassLink certification</w:t>
@@ -6809,6 +7635,7 @@
     <w:p>
       <w:pPr>
         <w:pStyle w:val="ListBullet"/>
+        <w:spacing w:line="312" w:lineRule="auto" w:after="0" w:before="0"/>
       </w:pPr>
       <w:r>
         <w:t>Update after production deployment</w:t>
@@ -6817,6 +7644,7 @@
     <w:p>
       <w:pPr>
         <w:pStyle w:val="ListBullet"/>
+        <w:spacing w:line="312" w:lineRule="auto" w:after="0" w:before="0"/>
       </w:pPr>
       <w:r>
         <w:t>Quarterly review for API changes</w:t>
@@ -6824,6 +7652,9 @@
     </w:p>
     <w:p/>
     <w:p>
+      <w:pPr>
+        <w:spacing w:line="312" w:lineRule="auto" w:after="120"/>
+      </w:pPr>
       <w:r>
         <w:rPr>
           <w:b/>
@@ -6834,6 +7665,7 @@
     <w:p>
       <w:pPr>
         <w:pStyle w:val="ListBullet"/>
+        <w:spacing w:line="312" w:lineRule="auto" w:after="0" w:before="0"/>
       </w:pPr>
       <w:r>
         <w:t>Development Team</w:t>
@@ -6842,6 +7674,7 @@
     <w:p>
       <w:pPr>
         <w:pStyle w:val="ListBullet"/>
+        <w:spacing w:line="312" w:lineRule="auto" w:after="0" w:before="0"/>
       </w:pPr>
       <w:r>
         <w:t>QA Team</w:t>
@@ -6850,6 +7683,7 @@
     <w:p>
       <w:pPr>
         <w:pStyle w:val="ListBullet"/>
+        <w:spacing w:line="312" w:lineRule="auto" w:after="0" w:before="0"/>
       </w:pPr>
       <w:r>
         <w:t>DevOps Team</w:t>
@@ -6858,6 +7692,7 @@
     <w:p>
       <w:pPr>
         <w:pStyle w:val="ListBullet"/>
+        <w:spacing w:line="312" w:lineRule="auto" w:after="0" w:before="0"/>
       </w:pPr>
       <w:r>
         <w:t>Product Management</w:t>
@@ -6866,6 +7701,7 @@
     <w:p>
       <w:pPr>
         <w:pStyle w:val="ListBullet"/>
+        <w:spacing w:line="312" w:lineRule="auto" w:after="0" w:before="0"/>
       </w:pPr>
       <w:r>
         <w:t>Support Team</w:t>
@@ -6874,6 +7710,9 @@
     <w:p/>
     <w:p/>
     <w:p>
+      <w:pPr>
+        <w:spacing w:line="312" w:lineRule="auto" w:after="120"/>
+      </w:pPr>
       <w:r>
         <w:rPr>
           <w:b/>

</xml_diff>